<commit_message>
ı edited project report
</commit_message>
<xml_diff>
--- a/CEN322_Project_Beyza_Aydin_Ahmet_Bera_Celik.docx
+++ b/CEN322_Project_Beyza_Aydin_Ahmet_Bera_Celik.docx
@@ -2018,7 +2018,6 @@
           <w14:ligatures w14:val="none"/>
         </w:rPr>
       </w:pPr>
-      <w:proofErr w:type="spellStart"/>
       <w:r>
         <w:rPr>
           <w:rFonts w:ascii="Arial" w:eastAsia="Times New Roman" w:hAnsi="Arial" w:cs="Arial"/>
@@ -2030,21 +2029,7 @@
           <w:lang w:val="tr-TR" w:eastAsia="en-GB"/>
           <w14:ligatures w14:val="none"/>
         </w:rPr>
-        <w:t>Student</w:t>
-      </w:r>
-      <w:proofErr w:type="spellEnd"/>
-      <w:r>
-        <w:rPr>
-          <w:rFonts w:ascii="Arial" w:eastAsia="Times New Roman" w:hAnsi="Arial" w:cs="Arial"/>
-          <w:b/>
-          <w:bCs/>
-          <w:kern w:val="0"/>
-          <w:sz w:val="28"/>
-          <w:szCs w:val="28"/>
-          <w:lang w:val="tr-TR" w:eastAsia="en-GB"/>
-          <w14:ligatures w14:val="none"/>
-        </w:rPr>
-        <w:t xml:space="preserve"> </w:t>
+        <w:t xml:space="preserve">Student </w:t>
       </w:r>
       <w:r>
         <w:rPr>
@@ -8342,63 +8327,22 @@
       <w:r>
         <w:rPr>
           <w:rFonts w:ascii="Arial" w:hAnsi="Arial" w:cs="Arial"/>
-          <w:sz w:val="24"/>
-          <w:szCs w:val="24"/>
-          <w:lang w:val="en-US" w:eastAsia="en-GB"/>
-        </w:rPr>
-        <w:t xml:space="preserve">The microphone and amplifier use two independent I2S buses so that recording and playback can be configured separately at 16 kHz. The MAX98357A does not share clock lines with the INMP441. Power for the amplifier and </w:t>
-      </w:r>
-      <w:proofErr w:type="spellStart"/>
-      <w:r>
-        <w:rPr>
-          <w:rFonts w:ascii="Arial" w:hAnsi="Arial" w:cs="Arial"/>
-          <w:sz w:val="24"/>
-          <w:szCs w:val="24"/>
-          <w:lang w:val="en-US" w:eastAsia="en-GB"/>
-        </w:rPr>
-        <w:t>NeoPixel</w:t>
-      </w:r>
-      <w:proofErr w:type="spellEnd"/>
-      <w:r>
-        <w:rPr>
-          <w:rFonts w:ascii="Arial" w:hAnsi="Arial" w:cs="Arial"/>
-          <w:sz w:val="24"/>
-          <w:szCs w:val="24"/>
-          <w:lang w:val="en-US" w:eastAsia="en-GB"/>
-        </w:rPr>
-        <w:t xml:space="preserve"> ring comes from the 5 V VBUS pin; the microphone and sensor are powered from 3.3 V. No wake word detection or pre-recorded audio clips in flash are used; the ESP32 streams microphone audio to the PC and plays back TTS audio received from the PC over UART.</w:t>
-      </w:r>
-    </w:p>
-    <w:p>
-      <w:pPr>
-        <w:rPr>
-          <w:rFonts w:ascii="Arial" w:hAnsi="Arial" w:cs="Arial"/>
           <w:noProof/>
           <w:sz w:val="24"/>
           <w:szCs w:val="24"/>
           <w:lang w:val="en-US" w:eastAsia="en-GB"/>
         </w:rPr>
-      </w:pPr>
-      <w:r>
-        <w:rPr>
-          <w:rFonts w:ascii="Arial" w:hAnsi="Arial" w:cs="Arial"/>
-          <w:noProof/>
-          <w:sz w:val="24"/>
-          <w:szCs w:val="24"/>
-          <w:lang w:val="en-US" w:eastAsia="en-GB"/>
-        </w:rPr>
-        <w:lastRenderedPageBreak/>
         <w:drawing>
-          <wp:anchor distT="0" distB="0" distL="114300" distR="114300" simplePos="0" relativeHeight="251659264" behindDoc="0" locked="0" layoutInCell="1" allowOverlap="1" wp14:anchorId="5923D0DE" wp14:editId="36CE87FA">
+          <wp:anchor distT="0" distB="0" distL="114300" distR="114300" simplePos="0" relativeHeight="251659264" behindDoc="0" locked="0" layoutInCell="1" allowOverlap="1" wp14:anchorId="5923D0DE" wp14:editId="4092E80A">
             <wp:simplePos x="0" y="0"/>
             <wp:positionH relativeFrom="column">
-              <wp:posOffset>685165</wp:posOffset>
+              <wp:posOffset>654685</wp:posOffset>
             </wp:positionH>
             <wp:positionV relativeFrom="paragraph">
-              <wp:posOffset>245745</wp:posOffset>
+              <wp:posOffset>1436370</wp:posOffset>
             </wp:positionV>
-            <wp:extent cx="4183522" cy="3866899"/>
-            <wp:effectExtent l="0" t="0" r="7620" b="635"/>
+            <wp:extent cx="4182745" cy="3810000"/>
+            <wp:effectExtent l="0" t="0" r="8255" b="0"/>
             <wp:wrapTopAndBottom/>
             <wp:docPr id="1845606502" name="Resim 2"/>
             <wp:cNvGraphicFramePr>
@@ -8429,7 +8373,7 @@
                   <pic:spPr bwMode="auto">
                     <a:xfrm>
                       <a:off x="0" y="0"/>
-                      <a:ext cx="4183522" cy="3866899"/>
+                      <a:ext cx="4182745" cy="3810000"/>
                     </a:xfrm>
                     <a:prstGeom prst="rect">
                       <a:avLst/>
@@ -8447,19 +8391,44 @@
                 </pic:pic>
               </a:graphicData>
             </a:graphic>
+            <wp14:sizeRelH relativeFrom="margin">
+              <wp14:pctWidth>0</wp14:pctWidth>
+            </wp14:sizeRelH>
+            <wp14:sizeRelV relativeFrom="margin">
+              <wp14:pctHeight>0</wp14:pctHeight>
+            </wp14:sizeRelV>
           </wp:anchor>
         </w:drawing>
       </w:r>
-    </w:p>
-    <w:p>
-      <w:pPr>
+      <w:r>
         <w:rPr>
           <w:rFonts w:ascii="Arial" w:hAnsi="Arial" w:cs="Arial"/>
           <w:sz w:val="24"/>
           <w:szCs w:val="24"/>
           <w:lang w:val="en-US" w:eastAsia="en-GB"/>
         </w:rPr>
-      </w:pPr>
+        <w:t xml:space="preserve">The microphone and amplifier use two independent I2S buses so that recording and playback can be configured separately at 16 kHz. The MAX98357A does not share clock lines with the INMP441. Power for the amplifier and </w:t>
+      </w:r>
+      <w:proofErr w:type="spellStart"/>
+      <w:r>
+        <w:rPr>
+          <w:rFonts w:ascii="Arial" w:hAnsi="Arial" w:cs="Arial"/>
+          <w:sz w:val="24"/>
+          <w:szCs w:val="24"/>
+          <w:lang w:val="en-US" w:eastAsia="en-GB"/>
+        </w:rPr>
+        <w:t>NeoPixel</w:t>
+      </w:r>
+      <w:proofErr w:type="spellEnd"/>
+      <w:r>
+        <w:rPr>
+          <w:rFonts w:ascii="Arial" w:hAnsi="Arial" w:cs="Arial"/>
+          <w:sz w:val="24"/>
+          <w:szCs w:val="24"/>
+          <w:lang w:val="en-US" w:eastAsia="en-GB"/>
+        </w:rPr>
+        <w:t xml:space="preserve"> ring comes from the 5 V VBUS pin; the microphone and sensor are powered from 3.3 V. No wake word detection or pre-recorded audio clips in flash are used; the ESP32 streams microphone audio to the PC and plays back TTS audio received from the PC over UART.</w:t>
+      </w:r>
     </w:p>
     <w:p>
       <w:pPr>
@@ -8481,7 +8450,7 @@
           <w:szCs w:val="24"/>
           <w:lang w:eastAsia="en-GB"/>
         </w:rPr>
-        <w:t>Figure 5.2 — Physical prototype</w:t>
+        <w:t xml:space="preserve">               </w:t>
       </w:r>
       <w:r>
         <w:rPr>
@@ -8492,6 +8461,17 @@
           <w:szCs w:val="24"/>
           <w:lang w:eastAsia="en-GB"/>
         </w:rPr>
+        <w:t>Figure 5.2 — Physical prototype</w:t>
+      </w:r>
+      <w:r>
+        <w:rPr>
+          <w:rFonts w:ascii="Arial" w:hAnsi="Arial" w:cs="Arial"/>
+          <w:b/>
+          <w:bCs/>
+          <w:sz w:val="24"/>
+          <w:szCs w:val="24"/>
+          <w:lang w:eastAsia="en-GB"/>
+        </w:rPr>
         <w:t xml:space="preserve"> </w:t>
       </w:r>
     </w:p>
@@ -8524,6 +8504,7 @@
           <w:lang w:eastAsia="en-GB"/>
           <w14:ligatures w14:val="none"/>
         </w:rPr>
+        <w:lastRenderedPageBreak/>
         <w:t>6. Arduino Codes and Explanation</w:t>
       </w:r>
     </w:p>
@@ -8864,20 +8845,7 @@
           <w:lang w:eastAsia="en-GB"/>
           <w14:ligatures w14:val="none"/>
         </w:rPr>
-        <w:t xml:space="preserve"> to the recording pattern. MSG_STOP_RECORD stops capture and sets PROCESSING while the PC runs Whisper, Llama, and Piper. Incoming </w:t>
-      </w:r>
-      <w:r>
-        <w:rPr>
-          <w:rFonts w:ascii="Arial" w:eastAsia="Times New Roman" w:hAnsi="Arial" w:cs="Arial"/>
-          <w:color w:val="0F1115"/>
-          <w:kern w:val="0"/>
-          <w:sz w:val="24"/>
-          <w:szCs w:val="24"/>
-          <w:lang w:eastAsia="en-GB"/>
-          <w14:ligatures w14:val="none"/>
-        </w:rPr>
-        <w:lastRenderedPageBreak/>
-        <w:t>AUDIO_DOWN frames are decrypted and queued; the first chunk switches the state to SPEAKING and starts I2S output. After PLAYBACK_END, playback stops and the system returns to IDLE. A separate path handles MSG_READ_SENSOR when the user measures vitals from the GUI.</w:t>
+        <w:t xml:space="preserve"> to the recording pattern. MSG_STOP_RECORD stops capture and sets PROCESSING while the PC runs Whisper, Llama, and Piper. Incoming AUDIO_DOWN frames are decrypted and queued; the first chunk switches the state to SPEAKING and starts I2S output. After PLAYBACK_END, playback stops and the system returns to IDLE. A separate path handles MSG_READ_SENSOR when the user measures vitals from the GUI.</w:t>
       </w:r>
     </w:p>
     <w:p>
@@ -9888,6 +9856,7 @@
           <w:lang w:eastAsia="en-GB"/>
           <w14:ligatures w14:val="none"/>
         </w:rPr>
+        <w:lastRenderedPageBreak/>
         <w:t xml:space="preserve">static void </w:t>
       </w:r>
       <w:proofErr w:type="spellStart"/>
@@ -10863,7 +10832,6 @@
           <w:lang w:val="en-US" w:eastAsia="en-GB"/>
           <w14:ligatures w14:val="none"/>
         </w:rPr>
-        <w:lastRenderedPageBreak/>
         <w:t>Example 2 — Streaming microphone data to the PC (ESP32, C)</w:t>
       </w:r>
     </w:p>
@@ -12099,20 +12067,6 @@
           <w14:ligatures w14:val="none"/>
         </w:rPr>
       </w:pPr>
-      <w:r>
-        <w:rPr>
-          <w:rFonts w:ascii="Arial" w:eastAsia="Times New Roman" w:hAnsi="Arial" w:cs="Arial"/>
-          <w:color w:val="0F1115"/>
-          <w:kern w:val="0"/>
-          <w:sz w:val="24"/>
-          <w:szCs w:val="24"/>
-          <w:lang w:val="en-US" w:eastAsia="en-GB"/>
-          <w14:ligatures w14:val="none"/>
-        </w:rPr>
-        <w:pict w14:anchorId="2C4AED20">
-          <v:rect id="_x0000_i1027" style="width:0;height:1.5pt" o:hralign="center" o:hrstd="t" o:hr="t" fillcolor="#a0a0a0" stroked="f"/>
-        </w:pict>
-      </w:r>
     </w:p>
     <w:p>
       <w:pPr>
@@ -12150,16 +12104,16 @@
       <w:r>
         <w:rPr>
           <w:rFonts w:ascii="Arial" w:eastAsia="Times New Roman" w:hAnsi="Arial" w:cs="Arial"/>
-          <w:b/>
-          <w:bCs/>
-          <w:color w:val="0F1115"/>
-          <w:kern w:val="0"/>
-          <w:sz w:val="24"/>
-          <w:szCs w:val="24"/>
-          <w:lang w:val="en-US" w:eastAsia="en-GB"/>
-          <w14:ligatures w14:val="none"/>
-        </w:rPr>
-        <w:t>Example 3 — Framed protocol with CRC (shared idea, C on device)</w:t>
+          <w:color w:val="0F1115"/>
+          <w:kern w:val="0"/>
+          <w:sz w:val="24"/>
+          <w:szCs w:val="24"/>
+          <w:lang w:val="en-US" w:eastAsia="en-GB"/>
+          <w14:ligatures w14:val="none"/>
+        </w:rPr>
+        <w:pict w14:anchorId="2C4AED20">
+          <v:rect id="_x0000_i1031" style="width:0;height:1.5pt" o:hralign="center" o:bullet="t" o:hrstd="t" o:hr="t" fillcolor="#a0a0a0" stroked="f"/>
+        </w:pict>
       </w:r>
     </w:p>
     <w:p>
@@ -12184,120 +12138,19 @@
         </w:tabs>
         <w:wordWrap w:val="0"/>
         <w:spacing w:after="0" w:line="330" w:lineRule="atLeast"/>
-        <w:rPr>
-          <w:rFonts w:ascii="Arial" w:eastAsia="Times New Roman" w:hAnsi="Arial" w:cs="Arial"/>
-          <w:color w:val="0F1115"/>
-          <w:kern w:val="0"/>
-          <w:sz w:val="20"/>
-          <w:szCs w:val="20"/>
-          <w:lang w:val="en-US" w:eastAsia="en-GB"/>
-          <w14:ligatures w14:val="none"/>
-        </w:rPr>
-      </w:pPr>
-      <w:proofErr w:type="spellStart"/>
-      <w:r>
-        <w:rPr>
-          <w:rFonts w:ascii="Arial" w:eastAsia="Times New Roman" w:hAnsi="Arial" w:cs="Arial"/>
-          <w:color w:val="0F1115"/>
-          <w:kern w:val="0"/>
-          <w:sz w:val="20"/>
-          <w:szCs w:val="20"/>
-          <w:lang w:val="en-US" w:eastAsia="en-GB"/>
-          <w14:ligatures w14:val="none"/>
-        </w:rPr>
-        <w:t>esp_err_t</w:t>
-      </w:r>
-      <w:proofErr w:type="spellEnd"/>
-      <w:r>
-        <w:rPr>
-          <w:rFonts w:ascii="Arial" w:eastAsia="Times New Roman" w:hAnsi="Arial" w:cs="Arial"/>
-          <w:color w:val="0F1115"/>
-          <w:kern w:val="0"/>
-          <w:sz w:val="20"/>
-          <w:szCs w:val="20"/>
-          <w:lang w:val="en-US" w:eastAsia="en-GB"/>
-          <w14:ligatures w14:val="none"/>
-        </w:rPr>
-        <w:t xml:space="preserve"> </w:t>
-      </w:r>
-      <w:proofErr w:type="spellStart"/>
-      <w:r>
-        <w:rPr>
-          <w:rFonts w:ascii="Arial" w:eastAsia="Times New Roman" w:hAnsi="Arial" w:cs="Arial"/>
-          <w:color w:val="0F1115"/>
-          <w:kern w:val="0"/>
-          <w:sz w:val="20"/>
-          <w:szCs w:val="20"/>
-          <w:lang w:val="en-US" w:eastAsia="en-GB"/>
-          <w14:ligatures w14:val="none"/>
-        </w:rPr>
-        <w:t>protocol_frame_</w:t>
-      </w:r>
-      <w:proofErr w:type="gramStart"/>
-      <w:r>
-        <w:rPr>
-          <w:rFonts w:ascii="Arial" w:eastAsia="Times New Roman" w:hAnsi="Arial" w:cs="Arial"/>
-          <w:color w:val="0F1115"/>
-          <w:kern w:val="0"/>
-          <w:sz w:val="20"/>
-          <w:szCs w:val="20"/>
-          <w:lang w:val="en-US" w:eastAsia="en-GB"/>
-          <w14:ligatures w14:val="none"/>
-        </w:rPr>
-        <w:t>pack</w:t>
-      </w:r>
-      <w:proofErr w:type="spellEnd"/>
-      <w:r>
-        <w:rPr>
-          <w:rFonts w:ascii="Arial" w:eastAsia="Times New Roman" w:hAnsi="Arial" w:cs="Arial"/>
-          <w:color w:val="0F1115"/>
-          <w:kern w:val="0"/>
-          <w:sz w:val="20"/>
-          <w:szCs w:val="20"/>
-          <w:lang w:val="en-US" w:eastAsia="en-GB"/>
-          <w14:ligatures w14:val="none"/>
-        </w:rPr>
-        <w:t>(</w:t>
-      </w:r>
-      <w:proofErr w:type="gramEnd"/>
-      <w:r>
-        <w:rPr>
-          <w:rFonts w:ascii="Arial" w:eastAsia="Times New Roman" w:hAnsi="Arial" w:cs="Arial"/>
-          <w:color w:val="0F1115"/>
-          <w:kern w:val="0"/>
-          <w:sz w:val="20"/>
-          <w:szCs w:val="20"/>
-          <w:lang w:val="en-US" w:eastAsia="en-GB"/>
-          <w14:ligatures w14:val="none"/>
-        </w:rPr>
-        <w:t xml:space="preserve">uint8_t type, const uint8_t *payload, </w:t>
-      </w:r>
-      <w:proofErr w:type="spellStart"/>
-      <w:r>
-        <w:rPr>
-          <w:rFonts w:ascii="Arial" w:eastAsia="Times New Roman" w:hAnsi="Arial" w:cs="Arial"/>
-          <w:color w:val="0F1115"/>
-          <w:kern w:val="0"/>
-          <w:sz w:val="20"/>
-          <w:szCs w:val="20"/>
-          <w:lang w:val="en-US" w:eastAsia="en-GB"/>
-          <w14:ligatures w14:val="none"/>
-        </w:rPr>
-        <w:t>size_t</w:t>
-      </w:r>
-      <w:proofErr w:type="spellEnd"/>
-      <w:r>
-        <w:rPr>
-          <w:rFonts w:ascii="Arial" w:eastAsia="Times New Roman" w:hAnsi="Arial" w:cs="Arial"/>
-          <w:color w:val="0F1115"/>
-          <w:kern w:val="0"/>
-          <w:sz w:val="20"/>
-          <w:szCs w:val="20"/>
-          <w:lang w:val="en-US" w:eastAsia="en-GB"/>
-          <w14:ligatures w14:val="none"/>
-        </w:rPr>
-        <w:t xml:space="preserve"> payload_len,</w:t>
-      </w:r>
+        <w:jc w:val="both"/>
+        <w:rPr>
+          <w:rFonts w:ascii="Arial" w:eastAsia="Times New Roman" w:hAnsi="Arial" w:cs="Arial"/>
+          <w:b/>
+          <w:bCs/>
+          <w:color w:val="0F1115"/>
+          <w:kern w:val="0"/>
+          <w:sz w:val="24"/>
+          <w:szCs w:val="24"/>
+          <w:lang w:val="en-US" w:eastAsia="en-GB"/>
+          <w14:ligatures w14:val="none"/>
+        </w:rPr>
+      </w:pPr>
     </w:p>
     <w:p>
       <w:pPr>
@@ -12321,131 +12174,31 @@
         </w:tabs>
         <w:wordWrap w:val="0"/>
         <w:spacing w:after="0" w:line="330" w:lineRule="atLeast"/>
-        <w:rPr>
-          <w:rFonts w:ascii="Arial" w:eastAsia="Times New Roman" w:hAnsi="Arial" w:cs="Arial"/>
-          <w:color w:val="0F1115"/>
-          <w:kern w:val="0"/>
-          <w:sz w:val="20"/>
-          <w:szCs w:val="20"/>
-          <w:lang w:val="en-US" w:eastAsia="en-GB"/>
-          <w14:ligatures w14:val="none"/>
-        </w:rPr>
-      </w:pPr>
-      <w:r>
-        <w:rPr>
-          <w:rFonts w:ascii="Arial" w:eastAsia="Times New Roman" w:hAnsi="Arial" w:cs="Arial"/>
-          <w:color w:val="0F1115"/>
-          <w:kern w:val="0"/>
-          <w:sz w:val="20"/>
-          <w:szCs w:val="20"/>
-          <w:lang w:val="en-US" w:eastAsia="en-GB"/>
-          <w14:ligatures w14:val="none"/>
-        </w:rPr>
-        <w:t xml:space="preserve">                              uint8_t *out, </w:t>
-      </w:r>
-      <w:proofErr w:type="spellStart"/>
-      <w:r>
-        <w:rPr>
-          <w:rFonts w:ascii="Arial" w:eastAsia="Times New Roman" w:hAnsi="Arial" w:cs="Arial"/>
-          <w:color w:val="0F1115"/>
-          <w:kern w:val="0"/>
-          <w:sz w:val="20"/>
-          <w:szCs w:val="20"/>
-          <w:lang w:val="en-US" w:eastAsia="en-GB"/>
-          <w14:ligatures w14:val="none"/>
-        </w:rPr>
-        <w:t>size_t</w:t>
-      </w:r>
-      <w:proofErr w:type="spellEnd"/>
-      <w:r>
-        <w:rPr>
-          <w:rFonts w:ascii="Arial" w:eastAsia="Times New Roman" w:hAnsi="Arial" w:cs="Arial"/>
-          <w:color w:val="0F1115"/>
-          <w:kern w:val="0"/>
-          <w:sz w:val="20"/>
-          <w:szCs w:val="20"/>
-          <w:lang w:val="en-US" w:eastAsia="en-GB"/>
-          <w14:ligatures w14:val="none"/>
-        </w:rPr>
-        <w:t xml:space="preserve"> </w:t>
-      </w:r>
-      <w:proofErr w:type="spellStart"/>
-      <w:r>
-        <w:rPr>
-          <w:rFonts w:ascii="Arial" w:eastAsia="Times New Roman" w:hAnsi="Arial" w:cs="Arial"/>
-          <w:color w:val="0F1115"/>
-          <w:kern w:val="0"/>
-          <w:sz w:val="20"/>
-          <w:szCs w:val="20"/>
-          <w:lang w:val="en-US" w:eastAsia="en-GB"/>
-          <w14:ligatures w14:val="none"/>
-        </w:rPr>
-        <w:t>out_cap</w:t>
-      </w:r>
-      <w:proofErr w:type="spellEnd"/>
-      <w:r>
-        <w:rPr>
-          <w:rFonts w:ascii="Arial" w:eastAsia="Times New Roman" w:hAnsi="Arial" w:cs="Arial"/>
-          <w:color w:val="0F1115"/>
-          <w:kern w:val="0"/>
-          <w:sz w:val="20"/>
-          <w:szCs w:val="20"/>
-          <w:lang w:val="en-US" w:eastAsia="en-GB"/>
-          <w14:ligatures w14:val="none"/>
-        </w:rPr>
-        <w:t xml:space="preserve">, </w:t>
-      </w:r>
-      <w:proofErr w:type="spellStart"/>
-      <w:r>
-        <w:rPr>
-          <w:rFonts w:ascii="Arial" w:eastAsia="Times New Roman" w:hAnsi="Arial" w:cs="Arial"/>
-          <w:color w:val="0F1115"/>
-          <w:kern w:val="0"/>
-          <w:sz w:val="20"/>
-          <w:szCs w:val="20"/>
-          <w:lang w:val="en-US" w:eastAsia="en-GB"/>
-          <w14:ligatures w14:val="none"/>
-        </w:rPr>
-        <w:t>size_t</w:t>
-      </w:r>
-      <w:proofErr w:type="spellEnd"/>
-      <w:r>
-        <w:rPr>
-          <w:rFonts w:ascii="Arial" w:eastAsia="Times New Roman" w:hAnsi="Arial" w:cs="Arial"/>
-          <w:color w:val="0F1115"/>
-          <w:kern w:val="0"/>
-          <w:sz w:val="20"/>
-          <w:szCs w:val="20"/>
-          <w:lang w:val="en-US" w:eastAsia="en-GB"/>
-          <w14:ligatures w14:val="none"/>
-        </w:rPr>
-        <w:t xml:space="preserve"> *</w:t>
-      </w:r>
-      <w:proofErr w:type="spellStart"/>
-      <w:r>
-        <w:rPr>
-          <w:rFonts w:ascii="Arial" w:eastAsia="Times New Roman" w:hAnsi="Arial" w:cs="Arial"/>
-          <w:color w:val="0F1115"/>
-          <w:kern w:val="0"/>
-          <w:sz w:val="20"/>
-          <w:szCs w:val="20"/>
-          <w:lang w:val="en-US" w:eastAsia="en-GB"/>
-          <w14:ligatures w14:val="none"/>
-        </w:rPr>
-        <w:t>out_len</w:t>
-      </w:r>
-      <w:proofErr w:type="spellEnd"/>
-      <w:r>
-        <w:rPr>
-          <w:rFonts w:ascii="Arial" w:eastAsia="Times New Roman" w:hAnsi="Arial" w:cs="Arial"/>
-          <w:color w:val="0F1115"/>
-          <w:kern w:val="0"/>
-          <w:sz w:val="20"/>
-          <w:szCs w:val="20"/>
-          <w:lang w:val="en-US" w:eastAsia="en-GB"/>
-          <w14:ligatures w14:val="none"/>
-        </w:rPr>
-        <w:t>)</w:t>
+        <w:jc w:val="both"/>
+        <w:rPr>
+          <w:rFonts w:ascii="Arial" w:eastAsia="Times New Roman" w:hAnsi="Arial" w:cs="Arial"/>
+          <w:color w:val="0F1115"/>
+          <w:kern w:val="0"/>
+          <w:sz w:val="24"/>
+          <w:szCs w:val="24"/>
+          <w:lang w:val="en-US" w:eastAsia="en-GB"/>
+          <w14:ligatures w14:val="none"/>
+        </w:rPr>
+      </w:pPr>
+      <w:r>
+        <w:rPr>
+          <w:rFonts w:ascii="Arial" w:eastAsia="Times New Roman" w:hAnsi="Arial" w:cs="Arial"/>
+          <w:b/>
+          <w:bCs/>
+          <w:color w:val="0F1115"/>
+          <w:kern w:val="0"/>
+          <w:sz w:val="24"/>
+          <w:szCs w:val="24"/>
+          <w:lang w:val="en-US" w:eastAsia="en-GB"/>
+          <w14:ligatures w14:val="none"/>
+        </w:rPr>
+        <w:lastRenderedPageBreak/>
+        <w:t>Example 3 — Framed protocol with CRC (shared idea, C on device)</w:t>
       </w:r>
     </w:p>
     <w:p>
@@ -12480,17 +12233,109 @@
           <w14:ligatures w14:val="none"/>
         </w:rPr>
       </w:pPr>
-      <w:r>
-        <w:rPr>
-          <w:rFonts w:ascii="Arial" w:eastAsia="Times New Roman" w:hAnsi="Arial" w:cs="Arial"/>
-          <w:color w:val="0F1115"/>
-          <w:kern w:val="0"/>
-          <w:sz w:val="20"/>
-          <w:szCs w:val="20"/>
-          <w:lang w:val="en-US" w:eastAsia="en-GB"/>
-          <w14:ligatures w14:val="none"/>
-        </w:rPr>
-        <w:t>{</w:t>
+      <w:proofErr w:type="spellStart"/>
+      <w:r>
+        <w:rPr>
+          <w:rFonts w:ascii="Arial" w:eastAsia="Times New Roman" w:hAnsi="Arial" w:cs="Arial"/>
+          <w:color w:val="0F1115"/>
+          <w:kern w:val="0"/>
+          <w:sz w:val="20"/>
+          <w:szCs w:val="20"/>
+          <w:lang w:val="en-US" w:eastAsia="en-GB"/>
+          <w14:ligatures w14:val="none"/>
+        </w:rPr>
+        <w:t>esp_err_t</w:t>
+      </w:r>
+      <w:proofErr w:type="spellEnd"/>
+      <w:r>
+        <w:rPr>
+          <w:rFonts w:ascii="Arial" w:eastAsia="Times New Roman" w:hAnsi="Arial" w:cs="Arial"/>
+          <w:color w:val="0F1115"/>
+          <w:kern w:val="0"/>
+          <w:sz w:val="20"/>
+          <w:szCs w:val="20"/>
+          <w:lang w:val="en-US" w:eastAsia="en-GB"/>
+          <w14:ligatures w14:val="none"/>
+        </w:rPr>
+        <w:t xml:space="preserve"> </w:t>
+      </w:r>
+      <w:proofErr w:type="spellStart"/>
+      <w:r>
+        <w:rPr>
+          <w:rFonts w:ascii="Arial" w:eastAsia="Times New Roman" w:hAnsi="Arial" w:cs="Arial"/>
+          <w:color w:val="0F1115"/>
+          <w:kern w:val="0"/>
+          <w:sz w:val="20"/>
+          <w:szCs w:val="20"/>
+          <w:lang w:val="en-US" w:eastAsia="en-GB"/>
+          <w14:ligatures w14:val="none"/>
+        </w:rPr>
+        <w:t>protocol_frame_</w:t>
+      </w:r>
+      <w:proofErr w:type="gramStart"/>
+      <w:r>
+        <w:rPr>
+          <w:rFonts w:ascii="Arial" w:eastAsia="Times New Roman" w:hAnsi="Arial" w:cs="Arial"/>
+          <w:color w:val="0F1115"/>
+          <w:kern w:val="0"/>
+          <w:sz w:val="20"/>
+          <w:szCs w:val="20"/>
+          <w:lang w:val="en-US" w:eastAsia="en-GB"/>
+          <w14:ligatures w14:val="none"/>
+        </w:rPr>
+        <w:t>pack</w:t>
+      </w:r>
+      <w:proofErr w:type="spellEnd"/>
+      <w:r>
+        <w:rPr>
+          <w:rFonts w:ascii="Arial" w:eastAsia="Times New Roman" w:hAnsi="Arial" w:cs="Arial"/>
+          <w:color w:val="0F1115"/>
+          <w:kern w:val="0"/>
+          <w:sz w:val="20"/>
+          <w:szCs w:val="20"/>
+          <w:lang w:val="en-US" w:eastAsia="en-GB"/>
+          <w14:ligatures w14:val="none"/>
+        </w:rPr>
+        <w:t>(</w:t>
+      </w:r>
+      <w:proofErr w:type="gramEnd"/>
+      <w:r>
+        <w:rPr>
+          <w:rFonts w:ascii="Arial" w:eastAsia="Times New Roman" w:hAnsi="Arial" w:cs="Arial"/>
+          <w:color w:val="0F1115"/>
+          <w:kern w:val="0"/>
+          <w:sz w:val="20"/>
+          <w:szCs w:val="20"/>
+          <w:lang w:val="en-US" w:eastAsia="en-GB"/>
+          <w14:ligatures w14:val="none"/>
+        </w:rPr>
+        <w:t xml:space="preserve">uint8_t type, const uint8_t *payload, </w:t>
+      </w:r>
+      <w:proofErr w:type="spellStart"/>
+      <w:r>
+        <w:rPr>
+          <w:rFonts w:ascii="Arial" w:eastAsia="Times New Roman" w:hAnsi="Arial" w:cs="Arial"/>
+          <w:color w:val="0F1115"/>
+          <w:kern w:val="0"/>
+          <w:sz w:val="20"/>
+          <w:szCs w:val="20"/>
+          <w:lang w:val="en-US" w:eastAsia="en-GB"/>
+          <w14:ligatures w14:val="none"/>
+        </w:rPr>
+        <w:t>size_t</w:t>
+      </w:r>
+      <w:proofErr w:type="spellEnd"/>
+      <w:r>
+        <w:rPr>
+          <w:rFonts w:ascii="Arial" w:eastAsia="Times New Roman" w:hAnsi="Arial" w:cs="Arial"/>
+          <w:color w:val="0F1115"/>
+          <w:kern w:val="0"/>
+          <w:sz w:val="20"/>
+          <w:szCs w:val="20"/>
+          <w:lang w:val="en-US" w:eastAsia="en-GB"/>
+          <w14:ligatures w14:val="none"/>
+        </w:rPr>
+        <w:t xml:space="preserve"> payload_len,</w:t>
       </w:r>
     </w:p>
     <w:p>
@@ -12535,75 +12380,111 @@
           <w:lang w:val="en-US" w:eastAsia="en-GB"/>
           <w14:ligatures w14:val="none"/>
         </w:rPr>
-        <w:t xml:space="preserve">    </w:t>
-      </w:r>
-      <w:proofErr w:type="gramStart"/>
-      <w:r>
-        <w:rPr>
-          <w:rFonts w:ascii="Arial" w:eastAsia="Times New Roman" w:hAnsi="Arial" w:cs="Arial"/>
-          <w:color w:val="0F1115"/>
-          <w:kern w:val="0"/>
-          <w:sz w:val="20"/>
-          <w:szCs w:val="20"/>
-          <w:lang w:val="en-US" w:eastAsia="en-GB"/>
-          <w14:ligatures w14:val="none"/>
-        </w:rPr>
-        <w:t>out[</w:t>
-      </w:r>
-      <w:proofErr w:type="gramEnd"/>
-      <w:r>
-        <w:rPr>
-          <w:rFonts w:ascii="Arial" w:eastAsia="Times New Roman" w:hAnsi="Arial" w:cs="Arial"/>
-          <w:color w:val="0F1115"/>
-          <w:kern w:val="0"/>
-          <w:sz w:val="20"/>
-          <w:szCs w:val="20"/>
-          <w:lang w:val="en-US" w:eastAsia="en-GB"/>
-          <w14:ligatures w14:val="none"/>
-        </w:rPr>
-        <w:t>0] = PROTO_SYNC</w:t>
-      </w:r>
-      <w:proofErr w:type="gramStart"/>
-      <w:r>
-        <w:rPr>
-          <w:rFonts w:ascii="Arial" w:eastAsia="Times New Roman" w:hAnsi="Arial" w:cs="Arial"/>
-          <w:color w:val="0F1115"/>
-          <w:kern w:val="0"/>
-          <w:sz w:val="20"/>
-          <w:szCs w:val="20"/>
-          <w:lang w:val="en-US" w:eastAsia="en-GB"/>
-          <w14:ligatures w14:val="none"/>
-        </w:rPr>
-        <w:t>0;</w:t>
-      </w:r>
-      <w:r>
-        <w:rPr>
-          <w:rFonts w:ascii="Arial" w:eastAsia="Times New Roman" w:hAnsi="Arial" w:cs="Arial"/>
-          <w:i/>
-          <w:iCs/>
-          <w:color w:val="0F1115"/>
-          <w:kern w:val="0"/>
-          <w:sz w:val="20"/>
-          <w:szCs w:val="20"/>
-          <w:lang w:val="en-US" w:eastAsia="en-GB"/>
-          <w14:ligatures w14:val="none"/>
-        </w:rPr>
-        <w:t xml:space="preserve">   </w:t>
-      </w:r>
-      <w:proofErr w:type="gramEnd"/>
-      <w:r>
-        <w:rPr>
-          <w:rFonts w:ascii="Arial" w:eastAsia="Times New Roman" w:hAnsi="Arial" w:cs="Arial"/>
-          <w:i/>
-          <w:iCs/>
-          <w:color w:val="0F1115"/>
-          <w:kern w:val="0"/>
-          <w:sz w:val="20"/>
-          <w:szCs w:val="20"/>
-          <w:lang w:val="en-US" w:eastAsia="en-GB"/>
-          <w14:ligatures w14:val="none"/>
-        </w:rPr>
-        <w:t>/* 0xAA */</w:t>
+        <w:t xml:space="preserve">                              uint8_t *out, </w:t>
+      </w:r>
+      <w:proofErr w:type="spellStart"/>
+      <w:r>
+        <w:rPr>
+          <w:rFonts w:ascii="Arial" w:eastAsia="Times New Roman" w:hAnsi="Arial" w:cs="Arial"/>
+          <w:color w:val="0F1115"/>
+          <w:kern w:val="0"/>
+          <w:sz w:val="20"/>
+          <w:szCs w:val="20"/>
+          <w:lang w:val="en-US" w:eastAsia="en-GB"/>
+          <w14:ligatures w14:val="none"/>
+        </w:rPr>
+        <w:t>size_t</w:t>
+      </w:r>
+      <w:proofErr w:type="spellEnd"/>
+      <w:r>
+        <w:rPr>
+          <w:rFonts w:ascii="Arial" w:eastAsia="Times New Roman" w:hAnsi="Arial" w:cs="Arial"/>
+          <w:color w:val="0F1115"/>
+          <w:kern w:val="0"/>
+          <w:sz w:val="20"/>
+          <w:szCs w:val="20"/>
+          <w:lang w:val="en-US" w:eastAsia="en-GB"/>
+          <w14:ligatures w14:val="none"/>
+        </w:rPr>
+        <w:t xml:space="preserve"> </w:t>
+      </w:r>
+      <w:proofErr w:type="spellStart"/>
+      <w:r>
+        <w:rPr>
+          <w:rFonts w:ascii="Arial" w:eastAsia="Times New Roman" w:hAnsi="Arial" w:cs="Arial"/>
+          <w:color w:val="0F1115"/>
+          <w:kern w:val="0"/>
+          <w:sz w:val="20"/>
+          <w:szCs w:val="20"/>
+          <w:lang w:val="en-US" w:eastAsia="en-GB"/>
+          <w14:ligatures w14:val="none"/>
+        </w:rPr>
+        <w:t>out_cap</w:t>
+      </w:r>
+      <w:proofErr w:type="spellEnd"/>
+      <w:r>
+        <w:rPr>
+          <w:rFonts w:ascii="Arial" w:eastAsia="Times New Roman" w:hAnsi="Arial" w:cs="Arial"/>
+          <w:color w:val="0F1115"/>
+          <w:kern w:val="0"/>
+          <w:sz w:val="20"/>
+          <w:szCs w:val="20"/>
+          <w:lang w:val="en-US" w:eastAsia="en-GB"/>
+          <w14:ligatures w14:val="none"/>
+        </w:rPr>
+        <w:t xml:space="preserve">, </w:t>
+      </w:r>
+      <w:proofErr w:type="spellStart"/>
+      <w:r>
+        <w:rPr>
+          <w:rFonts w:ascii="Arial" w:eastAsia="Times New Roman" w:hAnsi="Arial" w:cs="Arial"/>
+          <w:color w:val="0F1115"/>
+          <w:kern w:val="0"/>
+          <w:sz w:val="20"/>
+          <w:szCs w:val="20"/>
+          <w:lang w:val="en-US" w:eastAsia="en-GB"/>
+          <w14:ligatures w14:val="none"/>
+        </w:rPr>
+        <w:t>size_t</w:t>
+      </w:r>
+      <w:proofErr w:type="spellEnd"/>
+      <w:r>
+        <w:rPr>
+          <w:rFonts w:ascii="Arial" w:eastAsia="Times New Roman" w:hAnsi="Arial" w:cs="Arial"/>
+          <w:color w:val="0F1115"/>
+          <w:kern w:val="0"/>
+          <w:sz w:val="20"/>
+          <w:szCs w:val="20"/>
+          <w:lang w:val="en-US" w:eastAsia="en-GB"/>
+          <w14:ligatures w14:val="none"/>
+        </w:rPr>
+        <w:t xml:space="preserve"> *</w:t>
+      </w:r>
+      <w:proofErr w:type="spellStart"/>
+      <w:r>
+        <w:rPr>
+          <w:rFonts w:ascii="Arial" w:eastAsia="Times New Roman" w:hAnsi="Arial" w:cs="Arial"/>
+          <w:color w:val="0F1115"/>
+          <w:kern w:val="0"/>
+          <w:sz w:val="20"/>
+          <w:szCs w:val="20"/>
+          <w:lang w:val="en-US" w:eastAsia="en-GB"/>
+          <w14:ligatures w14:val="none"/>
+        </w:rPr>
+        <w:t>out_len</w:t>
+      </w:r>
+      <w:proofErr w:type="spellEnd"/>
+      <w:r>
+        <w:rPr>
+          <w:rFonts w:ascii="Arial" w:eastAsia="Times New Roman" w:hAnsi="Arial" w:cs="Arial"/>
+          <w:color w:val="0F1115"/>
+          <w:kern w:val="0"/>
+          <w:sz w:val="20"/>
+          <w:szCs w:val="20"/>
+          <w:lang w:val="en-US" w:eastAsia="en-GB"/>
+          <w14:ligatures w14:val="none"/>
+        </w:rPr>
+        <w:t>)</w:t>
       </w:r>
     </w:p>
     <w:p>
@@ -12648,75 +12529,7 @@
           <w:lang w:val="en-US" w:eastAsia="en-GB"/>
           <w14:ligatures w14:val="none"/>
         </w:rPr>
-        <w:t xml:space="preserve">    </w:t>
-      </w:r>
-      <w:proofErr w:type="gramStart"/>
-      <w:r>
-        <w:rPr>
-          <w:rFonts w:ascii="Arial" w:eastAsia="Times New Roman" w:hAnsi="Arial" w:cs="Arial"/>
-          <w:color w:val="0F1115"/>
-          <w:kern w:val="0"/>
-          <w:sz w:val="20"/>
-          <w:szCs w:val="20"/>
-          <w:lang w:val="en-US" w:eastAsia="en-GB"/>
-          <w14:ligatures w14:val="none"/>
-        </w:rPr>
-        <w:t>out[</w:t>
-      </w:r>
-      <w:proofErr w:type="gramEnd"/>
-      <w:r>
-        <w:rPr>
-          <w:rFonts w:ascii="Arial" w:eastAsia="Times New Roman" w:hAnsi="Arial" w:cs="Arial"/>
-          <w:color w:val="0F1115"/>
-          <w:kern w:val="0"/>
-          <w:sz w:val="20"/>
-          <w:szCs w:val="20"/>
-          <w:lang w:val="en-US" w:eastAsia="en-GB"/>
-          <w14:ligatures w14:val="none"/>
-        </w:rPr>
-        <w:t>1] = PROTO_SYNC</w:t>
-      </w:r>
-      <w:proofErr w:type="gramStart"/>
-      <w:r>
-        <w:rPr>
-          <w:rFonts w:ascii="Arial" w:eastAsia="Times New Roman" w:hAnsi="Arial" w:cs="Arial"/>
-          <w:color w:val="0F1115"/>
-          <w:kern w:val="0"/>
-          <w:sz w:val="20"/>
-          <w:szCs w:val="20"/>
-          <w:lang w:val="en-US" w:eastAsia="en-GB"/>
-          <w14:ligatures w14:val="none"/>
-        </w:rPr>
-        <w:t>1;</w:t>
-      </w:r>
-      <w:r>
-        <w:rPr>
-          <w:rFonts w:ascii="Arial" w:eastAsia="Times New Roman" w:hAnsi="Arial" w:cs="Arial"/>
-          <w:i/>
-          <w:iCs/>
-          <w:color w:val="0F1115"/>
-          <w:kern w:val="0"/>
-          <w:sz w:val="20"/>
-          <w:szCs w:val="20"/>
-          <w:lang w:val="en-US" w:eastAsia="en-GB"/>
-          <w14:ligatures w14:val="none"/>
-        </w:rPr>
-        <w:t xml:space="preserve">   </w:t>
-      </w:r>
-      <w:proofErr w:type="gramEnd"/>
-      <w:r>
-        <w:rPr>
-          <w:rFonts w:ascii="Arial" w:eastAsia="Times New Roman" w:hAnsi="Arial" w:cs="Arial"/>
-          <w:i/>
-          <w:iCs/>
-          <w:color w:val="0F1115"/>
-          <w:kern w:val="0"/>
-          <w:sz w:val="20"/>
-          <w:szCs w:val="20"/>
-          <w:lang w:val="en-US" w:eastAsia="en-GB"/>
-          <w14:ligatures w14:val="none"/>
-        </w:rPr>
-        <w:t>/* 0x55 */</w:t>
+        <w:t>{</w:t>
       </w:r>
     </w:p>
     <w:p>
@@ -12787,33 +12600,49 @@
           <w:lang w:val="en-US" w:eastAsia="en-GB"/>
           <w14:ligatures w14:val="none"/>
         </w:rPr>
-        <w:t>2] = (</w:t>
-      </w:r>
-      <w:proofErr w:type="spellStart"/>
-      <w:r>
-        <w:rPr>
-          <w:rFonts w:ascii="Arial" w:eastAsia="Times New Roman" w:hAnsi="Arial" w:cs="Arial"/>
-          <w:color w:val="0F1115"/>
-          <w:kern w:val="0"/>
-          <w:sz w:val="20"/>
-          <w:szCs w:val="20"/>
-          <w:lang w:val="en-US" w:eastAsia="en-GB"/>
-          <w14:ligatures w14:val="none"/>
-        </w:rPr>
-        <w:t>payload_len</w:t>
-      </w:r>
-      <w:proofErr w:type="spellEnd"/>
-      <w:r>
-        <w:rPr>
-          <w:rFonts w:ascii="Arial" w:eastAsia="Times New Roman" w:hAnsi="Arial" w:cs="Arial"/>
-          <w:color w:val="0F1115"/>
-          <w:kern w:val="0"/>
-          <w:sz w:val="20"/>
-          <w:szCs w:val="20"/>
-          <w:lang w:val="en-US" w:eastAsia="en-GB"/>
-          <w14:ligatures w14:val="none"/>
-        </w:rPr>
-        <w:t xml:space="preserve"> &gt;&gt; 8) &amp; 0xFF;</w:t>
+        <w:t>0] = PROTO_SYNC</w:t>
+      </w:r>
+      <w:proofErr w:type="gramStart"/>
+      <w:r>
+        <w:rPr>
+          <w:rFonts w:ascii="Arial" w:eastAsia="Times New Roman" w:hAnsi="Arial" w:cs="Arial"/>
+          <w:color w:val="0F1115"/>
+          <w:kern w:val="0"/>
+          <w:sz w:val="20"/>
+          <w:szCs w:val="20"/>
+          <w:lang w:val="en-US" w:eastAsia="en-GB"/>
+          <w14:ligatures w14:val="none"/>
+        </w:rPr>
+        <w:t>0;</w:t>
+      </w:r>
+      <w:r>
+        <w:rPr>
+          <w:rFonts w:ascii="Arial" w:eastAsia="Times New Roman" w:hAnsi="Arial" w:cs="Arial"/>
+          <w:i/>
+          <w:iCs/>
+          <w:color w:val="0F1115"/>
+          <w:kern w:val="0"/>
+          <w:sz w:val="20"/>
+          <w:szCs w:val="20"/>
+          <w:lang w:val="en-US" w:eastAsia="en-GB"/>
+          <w14:ligatures w14:val="none"/>
+        </w:rPr>
+        <w:t xml:space="preserve">   </w:t>
+      </w:r>
+      <w:proofErr w:type="gramEnd"/>
+      <w:r>
+        <w:rPr>
+          <w:rFonts w:ascii="Arial" w:eastAsia="Times New Roman" w:hAnsi="Arial" w:cs="Arial"/>
+          <w:i/>
+          <w:iCs/>
+          <w:color w:val="0F1115"/>
+          <w:kern w:val="0"/>
+          <w:sz w:val="20"/>
+          <w:szCs w:val="20"/>
+          <w:lang w:val="en-US" w:eastAsia="en-GB"/>
+          <w14:ligatures w14:val="none"/>
+        </w:rPr>
+        <w:t>/* 0xAA */</w:t>
       </w:r>
     </w:p>
     <w:p>
@@ -12884,33 +12713,49 @@
           <w:lang w:val="en-US" w:eastAsia="en-GB"/>
           <w14:ligatures w14:val="none"/>
         </w:rPr>
-        <w:t xml:space="preserve">3] = </w:t>
-      </w:r>
-      <w:proofErr w:type="spellStart"/>
-      <w:r>
-        <w:rPr>
-          <w:rFonts w:ascii="Arial" w:eastAsia="Times New Roman" w:hAnsi="Arial" w:cs="Arial"/>
-          <w:color w:val="0F1115"/>
-          <w:kern w:val="0"/>
-          <w:sz w:val="20"/>
-          <w:szCs w:val="20"/>
-          <w:lang w:val="en-US" w:eastAsia="en-GB"/>
-          <w14:ligatures w14:val="none"/>
-        </w:rPr>
-        <w:t>payload_len</w:t>
-      </w:r>
-      <w:proofErr w:type="spellEnd"/>
-      <w:r>
-        <w:rPr>
-          <w:rFonts w:ascii="Arial" w:eastAsia="Times New Roman" w:hAnsi="Arial" w:cs="Arial"/>
-          <w:color w:val="0F1115"/>
-          <w:kern w:val="0"/>
-          <w:sz w:val="20"/>
-          <w:szCs w:val="20"/>
-          <w:lang w:val="en-US" w:eastAsia="en-GB"/>
-          <w14:ligatures w14:val="none"/>
-        </w:rPr>
-        <w:t xml:space="preserve"> &amp; 0xFF;</w:t>
+        <w:t>1] = PROTO_SYNC</w:t>
+      </w:r>
+      <w:proofErr w:type="gramStart"/>
+      <w:r>
+        <w:rPr>
+          <w:rFonts w:ascii="Arial" w:eastAsia="Times New Roman" w:hAnsi="Arial" w:cs="Arial"/>
+          <w:color w:val="0F1115"/>
+          <w:kern w:val="0"/>
+          <w:sz w:val="20"/>
+          <w:szCs w:val="20"/>
+          <w:lang w:val="en-US" w:eastAsia="en-GB"/>
+          <w14:ligatures w14:val="none"/>
+        </w:rPr>
+        <w:t>1;</w:t>
+      </w:r>
+      <w:r>
+        <w:rPr>
+          <w:rFonts w:ascii="Arial" w:eastAsia="Times New Roman" w:hAnsi="Arial" w:cs="Arial"/>
+          <w:i/>
+          <w:iCs/>
+          <w:color w:val="0F1115"/>
+          <w:kern w:val="0"/>
+          <w:sz w:val="20"/>
+          <w:szCs w:val="20"/>
+          <w:lang w:val="en-US" w:eastAsia="en-GB"/>
+          <w14:ligatures w14:val="none"/>
+        </w:rPr>
+        <w:t xml:space="preserve">   </w:t>
+      </w:r>
+      <w:proofErr w:type="gramEnd"/>
+      <w:r>
+        <w:rPr>
+          <w:rFonts w:ascii="Arial" w:eastAsia="Times New Roman" w:hAnsi="Arial" w:cs="Arial"/>
+          <w:i/>
+          <w:iCs/>
+          <w:color w:val="0F1115"/>
+          <w:kern w:val="0"/>
+          <w:sz w:val="20"/>
+          <w:szCs w:val="20"/>
+          <w:lang w:val="en-US" w:eastAsia="en-GB"/>
+          <w14:ligatures w14:val="none"/>
+        </w:rPr>
+        <w:t>/* 0x55 */</w:t>
       </w:r>
     </w:p>
     <w:p>
@@ -12981,7 +12826,33 @@
           <w:lang w:val="en-US" w:eastAsia="en-GB"/>
           <w14:ligatures w14:val="none"/>
         </w:rPr>
-        <w:t>4] = type;</w:t>
+        <w:t>2] = (</w:t>
+      </w:r>
+      <w:proofErr w:type="spellStart"/>
+      <w:r>
+        <w:rPr>
+          <w:rFonts w:ascii="Arial" w:eastAsia="Times New Roman" w:hAnsi="Arial" w:cs="Arial"/>
+          <w:color w:val="0F1115"/>
+          <w:kern w:val="0"/>
+          <w:sz w:val="20"/>
+          <w:szCs w:val="20"/>
+          <w:lang w:val="en-US" w:eastAsia="en-GB"/>
+          <w14:ligatures w14:val="none"/>
+        </w:rPr>
+        <w:t>payload_len</w:t>
+      </w:r>
+      <w:proofErr w:type="spellEnd"/>
+      <w:r>
+        <w:rPr>
+          <w:rFonts w:ascii="Arial" w:eastAsia="Times New Roman" w:hAnsi="Arial" w:cs="Arial"/>
+          <w:color w:val="0F1115"/>
+          <w:kern w:val="0"/>
+          <w:sz w:val="20"/>
+          <w:szCs w:val="20"/>
+          <w:lang w:val="en-US" w:eastAsia="en-GB"/>
+          <w14:ligatures w14:val="none"/>
+        </w:rPr>
+        <w:t xml:space="preserve"> &gt;&gt; 8) &amp; 0xFF;</w:t>
       </w:r>
     </w:p>
     <w:p>
@@ -13028,19 +12899,44 @@
         </w:rPr>
         <w:t xml:space="preserve">    </w:t>
       </w:r>
+      <w:proofErr w:type="gramStart"/>
+      <w:r>
+        <w:rPr>
+          <w:rFonts w:ascii="Arial" w:eastAsia="Times New Roman" w:hAnsi="Arial" w:cs="Arial"/>
+          <w:color w:val="0F1115"/>
+          <w:kern w:val="0"/>
+          <w:sz w:val="20"/>
+          <w:szCs w:val="20"/>
+          <w:lang w:val="en-US" w:eastAsia="en-GB"/>
+          <w14:ligatures w14:val="none"/>
+        </w:rPr>
+        <w:t>out[</w:t>
+      </w:r>
+      <w:proofErr w:type="gramEnd"/>
+      <w:r>
+        <w:rPr>
+          <w:rFonts w:ascii="Arial" w:eastAsia="Times New Roman" w:hAnsi="Arial" w:cs="Arial"/>
+          <w:color w:val="0F1115"/>
+          <w:kern w:val="0"/>
+          <w:sz w:val="20"/>
+          <w:szCs w:val="20"/>
+          <w:lang w:val="en-US" w:eastAsia="en-GB"/>
+          <w14:ligatures w14:val="none"/>
+        </w:rPr>
+        <w:t xml:space="preserve">3] = </w:t>
+      </w:r>
       <w:proofErr w:type="spellStart"/>
-      <w:proofErr w:type="gramStart"/>
-      <w:r>
-        <w:rPr>
-          <w:rFonts w:ascii="Arial" w:eastAsia="Times New Roman" w:hAnsi="Arial" w:cs="Arial"/>
-          <w:color w:val="0F1115"/>
-          <w:kern w:val="0"/>
-          <w:sz w:val="20"/>
-          <w:szCs w:val="20"/>
-          <w:lang w:val="en-US" w:eastAsia="en-GB"/>
-          <w14:ligatures w14:val="none"/>
-        </w:rPr>
-        <w:t>memcpy</w:t>
+      <w:r>
+        <w:rPr>
+          <w:rFonts w:ascii="Arial" w:eastAsia="Times New Roman" w:hAnsi="Arial" w:cs="Arial"/>
+          <w:color w:val="0F1115"/>
+          <w:kern w:val="0"/>
+          <w:sz w:val="20"/>
+          <w:szCs w:val="20"/>
+          <w:lang w:val="en-US" w:eastAsia="en-GB"/>
+          <w14:ligatures w14:val="none"/>
+        </w:rPr>
+        <w:t>payload_len</w:t>
       </w:r>
       <w:proofErr w:type="spellEnd"/>
       <w:r>
@@ -13053,46 +12949,7 @@
           <w:lang w:val="en-US" w:eastAsia="en-GB"/>
           <w14:ligatures w14:val="none"/>
         </w:rPr>
-        <w:t>(</w:t>
-      </w:r>
-      <w:proofErr w:type="gramEnd"/>
-      <w:r>
-        <w:rPr>
-          <w:rFonts w:ascii="Arial" w:eastAsia="Times New Roman" w:hAnsi="Arial" w:cs="Arial"/>
-          <w:color w:val="0F1115"/>
-          <w:kern w:val="0"/>
-          <w:sz w:val="20"/>
-          <w:szCs w:val="20"/>
-          <w:lang w:val="en-US" w:eastAsia="en-GB"/>
-          <w14:ligatures w14:val="none"/>
-        </w:rPr>
-        <w:t xml:space="preserve">out + 5, payload, </w:t>
-      </w:r>
-      <w:proofErr w:type="spellStart"/>
-      <w:r>
-        <w:rPr>
-          <w:rFonts w:ascii="Arial" w:eastAsia="Times New Roman" w:hAnsi="Arial" w:cs="Arial"/>
-          <w:color w:val="0F1115"/>
-          <w:kern w:val="0"/>
-          <w:sz w:val="20"/>
-          <w:szCs w:val="20"/>
-          <w:lang w:val="en-US" w:eastAsia="en-GB"/>
-          <w14:ligatures w14:val="none"/>
-        </w:rPr>
-        <w:t>payload_len</w:t>
-      </w:r>
-      <w:proofErr w:type="spellEnd"/>
-      <w:r>
-        <w:rPr>
-          <w:rFonts w:ascii="Arial" w:eastAsia="Times New Roman" w:hAnsi="Arial" w:cs="Arial"/>
-          <w:color w:val="0F1115"/>
-          <w:kern w:val="0"/>
-          <w:sz w:val="20"/>
-          <w:szCs w:val="20"/>
-          <w:lang w:val="en-US" w:eastAsia="en-GB"/>
-          <w14:ligatures w14:val="none"/>
-        </w:rPr>
-        <w:t>);</w:t>
+        <w:t xml:space="preserve"> &amp; 0xFF;</w:t>
       </w:r>
     </w:p>
     <w:p>
@@ -13137,59 +12994,33 @@
           <w:lang w:val="en-US" w:eastAsia="en-GB"/>
           <w14:ligatures w14:val="none"/>
         </w:rPr>
-        <w:t xml:space="preserve">    uint16_t </w:t>
-      </w:r>
-      <w:proofErr w:type="spellStart"/>
-      <w:r>
-        <w:rPr>
-          <w:rFonts w:ascii="Arial" w:eastAsia="Times New Roman" w:hAnsi="Arial" w:cs="Arial"/>
-          <w:color w:val="0F1115"/>
-          <w:kern w:val="0"/>
-          <w:sz w:val="20"/>
-          <w:szCs w:val="20"/>
-          <w:lang w:val="en-US" w:eastAsia="en-GB"/>
-          <w14:ligatures w14:val="none"/>
-        </w:rPr>
-        <w:t>crc</w:t>
-      </w:r>
-      <w:proofErr w:type="spellEnd"/>
-      <w:r>
-        <w:rPr>
-          <w:rFonts w:ascii="Arial" w:eastAsia="Times New Roman" w:hAnsi="Arial" w:cs="Arial"/>
-          <w:color w:val="0F1115"/>
-          <w:kern w:val="0"/>
-          <w:sz w:val="20"/>
-          <w:szCs w:val="20"/>
-          <w:lang w:val="en-US" w:eastAsia="en-GB"/>
-          <w14:ligatures w14:val="none"/>
-        </w:rPr>
-        <w:t xml:space="preserve"> = protocol_crc16(out + 4, 1 + </w:t>
-      </w:r>
-      <w:proofErr w:type="spellStart"/>
-      <w:r>
-        <w:rPr>
-          <w:rFonts w:ascii="Arial" w:eastAsia="Times New Roman" w:hAnsi="Arial" w:cs="Arial"/>
-          <w:color w:val="0F1115"/>
-          <w:kern w:val="0"/>
-          <w:sz w:val="20"/>
-          <w:szCs w:val="20"/>
-          <w:lang w:val="en-US" w:eastAsia="en-GB"/>
-          <w14:ligatures w14:val="none"/>
-        </w:rPr>
-        <w:t>payload_len</w:t>
-      </w:r>
-      <w:proofErr w:type="spellEnd"/>
-      <w:r>
-        <w:rPr>
-          <w:rFonts w:ascii="Arial" w:eastAsia="Times New Roman" w:hAnsi="Arial" w:cs="Arial"/>
-          <w:color w:val="0F1115"/>
-          <w:kern w:val="0"/>
-          <w:sz w:val="20"/>
-          <w:szCs w:val="20"/>
-          <w:lang w:val="en-US" w:eastAsia="en-GB"/>
-          <w14:ligatures w14:val="none"/>
-        </w:rPr>
-        <w:t>);</w:t>
+        <w:t xml:space="preserve">    </w:t>
+      </w:r>
+      <w:proofErr w:type="gramStart"/>
+      <w:r>
+        <w:rPr>
+          <w:rFonts w:ascii="Arial" w:eastAsia="Times New Roman" w:hAnsi="Arial" w:cs="Arial"/>
+          <w:color w:val="0F1115"/>
+          <w:kern w:val="0"/>
+          <w:sz w:val="20"/>
+          <w:szCs w:val="20"/>
+          <w:lang w:val="en-US" w:eastAsia="en-GB"/>
+          <w14:ligatures w14:val="none"/>
+        </w:rPr>
+        <w:t>out[</w:t>
+      </w:r>
+      <w:proofErr w:type="gramEnd"/>
+      <w:r>
+        <w:rPr>
+          <w:rFonts w:ascii="Arial" w:eastAsia="Times New Roman" w:hAnsi="Arial" w:cs="Arial"/>
+          <w:color w:val="0F1115"/>
+          <w:kern w:val="0"/>
+          <w:sz w:val="20"/>
+          <w:szCs w:val="20"/>
+          <w:lang w:val="en-US" w:eastAsia="en-GB"/>
+          <w14:ligatures w14:val="none"/>
+        </w:rPr>
+        <w:t>4] = type;</w:t>
       </w:r>
     </w:p>
     <w:p>
@@ -13227,16 +13058,80 @@
       <w:r>
         <w:rPr>
           <w:rFonts w:ascii="Arial" w:eastAsia="Times New Roman" w:hAnsi="Arial" w:cs="Arial"/>
-          <w:i/>
-          <w:iCs/>
-          <w:color w:val="0F1115"/>
-          <w:kern w:val="0"/>
-          <w:sz w:val="20"/>
-          <w:szCs w:val="20"/>
-          <w:lang w:val="en-US" w:eastAsia="en-GB"/>
-          <w14:ligatures w14:val="none"/>
-        </w:rPr>
-        <w:t xml:space="preserve">    /* append CRC16 big-endian */</w:t>
+          <w:color w:val="0F1115"/>
+          <w:kern w:val="0"/>
+          <w:sz w:val="20"/>
+          <w:szCs w:val="20"/>
+          <w:lang w:val="en-US" w:eastAsia="en-GB"/>
+          <w14:ligatures w14:val="none"/>
+        </w:rPr>
+        <w:t xml:space="preserve">    </w:t>
+      </w:r>
+      <w:proofErr w:type="spellStart"/>
+      <w:proofErr w:type="gramStart"/>
+      <w:r>
+        <w:rPr>
+          <w:rFonts w:ascii="Arial" w:eastAsia="Times New Roman" w:hAnsi="Arial" w:cs="Arial"/>
+          <w:color w:val="0F1115"/>
+          <w:kern w:val="0"/>
+          <w:sz w:val="20"/>
+          <w:szCs w:val="20"/>
+          <w:lang w:val="en-US" w:eastAsia="en-GB"/>
+          <w14:ligatures w14:val="none"/>
+        </w:rPr>
+        <w:t>memcpy</w:t>
+      </w:r>
+      <w:proofErr w:type="spellEnd"/>
+      <w:r>
+        <w:rPr>
+          <w:rFonts w:ascii="Arial" w:eastAsia="Times New Roman" w:hAnsi="Arial" w:cs="Arial"/>
+          <w:color w:val="0F1115"/>
+          <w:kern w:val="0"/>
+          <w:sz w:val="20"/>
+          <w:szCs w:val="20"/>
+          <w:lang w:val="en-US" w:eastAsia="en-GB"/>
+          <w14:ligatures w14:val="none"/>
+        </w:rPr>
+        <w:t>(</w:t>
+      </w:r>
+      <w:proofErr w:type="gramEnd"/>
+      <w:r>
+        <w:rPr>
+          <w:rFonts w:ascii="Arial" w:eastAsia="Times New Roman" w:hAnsi="Arial" w:cs="Arial"/>
+          <w:color w:val="0F1115"/>
+          <w:kern w:val="0"/>
+          <w:sz w:val="20"/>
+          <w:szCs w:val="20"/>
+          <w:lang w:val="en-US" w:eastAsia="en-GB"/>
+          <w14:ligatures w14:val="none"/>
+        </w:rPr>
+        <w:t xml:space="preserve">out + 5, payload, </w:t>
+      </w:r>
+      <w:proofErr w:type="spellStart"/>
+      <w:r>
+        <w:rPr>
+          <w:rFonts w:ascii="Arial" w:eastAsia="Times New Roman" w:hAnsi="Arial" w:cs="Arial"/>
+          <w:color w:val="0F1115"/>
+          <w:kern w:val="0"/>
+          <w:sz w:val="20"/>
+          <w:szCs w:val="20"/>
+          <w:lang w:val="en-US" w:eastAsia="en-GB"/>
+          <w14:ligatures w14:val="none"/>
+        </w:rPr>
+        <w:t>payload_len</w:t>
+      </w:r>
+      <w:proofErr w:type="spellEnd"/>
+      <w:r>
+        <w:rPr>
+          <w:rFonts w:ascii="Arial" w:eastAsia="Times New Roman" w:hAnsi="Arial" w:cs="Arial"/>
+          <w:color w:val="0F1115"/>
+          <w:kern w:val="0"/>
+          <w:sz w:val="20"/>
+          <w:szCs w:val="20"/>
+          <w:lang w:val="en-US" w:eastAsia="en-GB"/>
+          <w14:ligatures w14:val="none"/>
+        </w:rPr>
+        <w:t>);</w:t>
       </w:r>
     </w:p>
     <w:p>
@@ -13281,7 +13176,59 @@
           <w:lang w:val="en-US" w:eastAsia="en-GB"/>
           <w14:ligatures w14:val="none"/>
         </w:rPr>
-        <w:t xml:space="preserve">    ...</w:t>
+        <w:t xml:space="preserve">    uint16_t </w:t>
+      </w:r>
+      <w:proofErr w:type="spellStart"/>
+      <w:r>
+        <w:rPr>
+          <w:rFonts w:ascii="Arial" w:eastAsia="Times New Roman" w:hAnsi="Arial" w:cs="Arial"/>
+          <w:color w:val="0F1115"/>
+          <w:kern w:val="0"/>
+          <w:sz w:val="20"/>
+          <w:szCs w:val="20"/>
+          <w:lang w:val="en-US" w:eastAsia="en-GB"/>
+          <w14:ligatures w14:val="none"/>
+        </w:rPr>
+        <w:t>crc</w:t>
+      </w:r>
+      <w:proofErr w:type="spellEnd"/>
+      <w:r>
+        <w:rPr>
+          <w:rFonts w:ascii="Arial" w:eastAsia="Times New Roman" w:hAnsi="Arial" w:cs="Arial"/>
+          <w:color w:val="0F1115"/>
+          <w:kern w:val="0"/>
+          <w:sz w:val="20"/>
+          <w:szCs w:val="20"/>
+          <w:lang w:val="en-US" w:eastAsia="en-GB"/>
+          <w14:ligatures w14:val="none"/>
+        </w:rPr>
+        <w:t xml:space="preserve"> = protocol_crc16(out + 4, 1 + </w:t>
+      </w:r>
+      <w:proofErr w:type="spellStart"/>
+      <w:r>
+        <w:rPr>
+          <w:rFonts w:ascii="Arial" w:eastAsia="Times New Roman" w:hAnsi="Arial" w:cs="Arial"/>
+          <w:color w:val="0F1115"/>
+          <w:kern w:val="0"/>
+          <w:sz w:val="20"/>
+          <w:szCs w:val="20"/>
+          <w:lang w:val="en-US" w:eastAsia="en-GB"/>
+          <w14:ligatures w14:val="none"/>
+        </w:rPr>
+        <w:t>payload_len</w:t>
+      </w:r>
+      <w:proofErr w:type="spellEnd"/>
+      <w:r>
+        <w:rPr>
+          <w:rFonts w:ascii="Arial" w:eastAsia="Times New Roman" w:hAnsi="Arial" w:cs="Arial"/>
+          <w:color w:val="0F1115"/>
+          <w:kern w:val="0"/>
+          <w:sz w:val="20"/>
+          <w:szCs w:val="20"/>
+          <w:lang w:val="en-US" w:eastAsia="en-GB"/>
+          <w14:ligatures w14:val="none"/>
+        </w:rPr>
+        <w:t>);</w:t>
       </w:r>
     </w:p>
     <w:p>
@@ -13319,14 +13266,16 @@
       <w:r>
         <w:rPr>
           <w:rFonts w:ascii="Arial" w:eastAsia="Times New Roman" w:hAnsi="Arial" w:cs="Arial"/>
-          <w:color w:val="0F1115"/>
-          <w:kern w:val="0"/>
-          <w:sz w:val="20"/>
-          <w:szCs w:val="20"/>
-          <w:lang w:val="en-US" w:eastAsia="en-GB"/>
-          <w14:ligatures w14:val="none"/>
-        </w:rPr>
-        <w:t>}</w:t>
+          <w:i/>
+          <w:iCs/>
+          <w:color w:val="0F1115"/>
+          <w:kern w:val="0"/>
+          <w:sz w:val="20"/>
+          <w:szCs w:val="20"/>
+          <w:lang w:val="en-US" w:eastAsia="en-GB"/>
+          <w14:ligatures w14:val="none"/>
+        </w:rPr>
+        <w:t xml:space="preserve">    /* append CRC16 big-endian */</w:t>
       </w:r>
     </w:p>
     <w:p>
@@ -13351,44 +13300,27 @@
         </w:tabs>
         <w:wordWrap w:val="0"/>
         <w:spacing w:after="0" w:line="330" w:lineRule="atLeast"/>
-        <w:jc w:val="both"/>
-        <w:rPr>
-          <w:rFonts w:ascii="Arial" w:eastAsia="Times New Roman" w:hAnsi="Arial" w:cs="Arial"/>
-          <w:color w:val="0F1115"/>
-          <w:kern w:val="0"/>
-          <w:sz w:val="24"/>
-          <w:szCs w:val="24"/>
-          <w:lang w:val="en-US" w:eastAsia="en-GB"/>
-          <w14:ligatures w14:val="none"/>
-        </w:rPr>
-      </w:pPr>
-      <w:r>
-        <w:rPr>
-          <w:rFonts w:ascii="Arial" w:eastAsia="Times New Roman" w:hAnsi="Arial" w:cs="Arial"/>
-          <w:b/>
-          <w:bCs/>
-          <w:i/>
-          <w:iCs/>
-          <w:color w:val="0F1115"/>
-          <w:kern w:val="0"/>
-          <w:sz w:val="24"/>
-          <w:szCs w:val="24"/>
-          <w:lang w:val="en-US" w:eastAsia="en-GB"/>
-          <w14:ligatures w14:val="none"/>
-        </w:rPr>
-        <w:t>What it does:</w:t>
-      </w:r>
-      <w:r>
-        <w:rPr>
-          <w:rFonts w:ascii="Arial" w:eastAsia="Times New Roman" w:hAnsi="Arial" w:cs="Arial"/>
-          <w:color w:val="0F1115"/>
-          <w:kern w:val="0"/>
-          <w:sz w:val="24"/>
-          <w:szCs w:val="24"/>
-          <w:lang w:val="en-US" w:eastAsia="en-GB"/>
-          <w14:ligatures w14:val="none"/>
-        </w:rPr>
-        <w:t> Every message has a fixed sync word, length, type byte, payload, and CRC16-CCITT so the PC and ESP32 stay aligned even if bytes are lost briefly.</w:t>
+        <w:rPr>
+          <w:rFonts w:ascii="Arial" w:eastAsia="Times New Roman" w:hAnsi="Arial" w:cs="Arial"/>
+          <w:color w:val="0F1115"/>
+          <w:kern w:val="0"/>
+          <w:sz w:val="20"/>
+          <w:szCs w:val="20"/>
+          <w:lang w:val="en-US" w:eastAsia="en-GB"/>
+          <w14:ligatures w14:val="none"/>
+        </w:rPr>
+      </w:pPr>
+      <w:r>
+        <w:rPr>
+          <w:rFonts w:ascii="Arial" w:eastAsia="Times New Roman" w:hAnsi="Arial" w:cs="Arial"/>
+          <w:color w:val="0F1115"/>
+          <w:kern w:val="0"/>
+          <w:sz w:val="20"/>
+          <w:szCs w:val="20"/>
+          <w:lang w:val="en-US" w:eastAsia="en-GB"/>
+          <w14:ligatures w14:val="none"/>
+        </w:rPr>
+        <w:t xml:space="preserve">    ...</w:t>
       </w:r>
     </w:p>
     <w:p>
@@ -13413,70 +13345,27 @@
         </w:tabs>
         <w:wordWrap w:val="0"/>
         <w:spacing w:after="0" w:line="330" w:lineRule="atLeast"/>
-        <w:jc w:val="both"/>
-        <w:rPr>
-          <w:rFonts w:ascii="Arial" w:eastAsia="Times New Roman" w:hAnsi="Arial" w:cs="Arial"/>
-          <w:color w:val="0F1115"/>
-          <w:kern w:val="0"/>
-          <w:sz w:val="24"/>
-          <w:szCs w:val="24"/>
-          <w:lang w:val="en-US" w:eastAsia="en-GB"/>
-          <w14:ligatures w14:val="none"/>
-        </w:rPr>
-      </w:pPr>
-      <w:r>
-        <w:rPr>
-          <w:rFonts w:ascii="Arial" w:eastAsia="Times New Roman" w:hAnsi="Arial" w:cs="Arial"/>
-          <w:b/>
-          <w:bCs/>
-          <w:i/>
-          <w:iCs/>
-          <w:color w:val="0F1115"/>
-          <w:kern w:val="0"/>
-          <w:sz w:val="24"/>
-          <w:szCs w:val="24"/>
-          <w:lang w:val="en-US" w:eastAsia="en-GB"/>
-          <w14:ligatures w14:val="none"/>
-        </w:rPr>
-        <w:t>Why it is needed:</w:t>
-      </w:r>
-      <w:r>
-        <w:rPr>
-          <w:rFonts w:ascii="Arial" w:eastAsia="Times New Roman" w:hAnsi="Arial" w:cs="Arial"/>
-          <w:color w:val="0F1115"/>
-          <w:kern w:val="0"/>
-          <w:sz w:val="24"/>
-          <w:szCs w:val="24"/>
-          <w:lang w:val="en-US" w:eastAsia="en-GB"/>
-          <w14:ligatures w14:val="none"/>
-        </w:rPr>
-        <w:t xml:space="preserve"> Raw serial bytes would be fragile at 921600 baud with audio traffic. </w:t>
-      </w:r>
-      <w:proofErr w:type="gramStart"/>
-      <w:r>
-        <w:rPr>
-          <w:rFonts w:ascii="Arial" w:eastAsia="Times New Roman" w:hAnsi="Arial" w:cs="Arial"/>
-          <w:color w:val="0F1115"/>
-          <w:kern w:val="0"/>
-          <w:sz w:val="24"/>
-          <w:szCs w:val="24"/>
-          <w:lang w:val="en-US" w:eastAsia="en-GB"/>
-          <w14:ligatures w14:val="none"/>
-        </w:rPr>
-        <w:t>Framing</w:t>
-      </w:r>
-      <w:proofErr w:type="gramEnd"/>
-      <w:r>
-        <w:rPr>
-          <w:rFonts w:ascii="Arial" w:eastAsia="Times New Roman" w:hAnsi="Arial" w:cs="Arial"/>
-          <w:color w:val="0F1115"/>
-          <w:kern w:val="0"/>
-          <w:sz w:val="24"/>
-          <w:szCs w:val="24"/>
-          <w:lang w:val="en-US" w:eastAsia="en-GB"/>
-          <w14:ligatures w14:val="none"/>
-        </w:rPr>
-        <w:t xml:space="preserve"> is part of a reliable course demo and works together with AES on audio and sensor payloads.</w:t>
+        <w:rPr>
+          <w:rFonts w:ascii="Arial" w:eastAsia="Times New Roman" w:hAnsi="Arial" w:cs="Arial"/>
+          <w:color w:val="0F1115"/>
+          <w:kern w:val="0"/>
+          <w:sz w:val="20"/>
+          <w:szCs w:val="20"/>
+          <w:lang w:val="en-US" w:eastAsia="en-GB"/>
+          <w14:ligatures w14:val="none"/>
+        </w:rPr>
+      </w:pPr>
+      <w:r>
+        <w:rPr>
+          <w:rFonts w:ascii="Arial" w:eastAsia="Times New Roman" w:hAnsi="Arial" w:cs="Arial"/>
+          <w:color w:val="0F1115"/>
+          <w:kern w:val="0"/>
+          <w:sz w:val="20"/>
+          <w:szCs w:val="20"/>
+          <w:lang w:val="en-US" w:eastAsia="en-GB"/>
+          <w14:ligatures w14:val="none"/>
+        </w:rPr>
+        <w:t>}</w:t>
       </w:r>
     </w:p>
     <w:p>
@@ -13501,29 +13390,44 @@
         </w:tabs>
         <w:wordWrap w:val="0"/>
         <w:spacing w:after="0" w:line="330" w:lineRule="atLeast"/>
-        <w:rPr>
-          <w:rFonts w:ascii="Arial" w:eastAsia="Times New Roman" w:hAnsi="Arial" w:cs="Arial"/>
-          <w:color w:val="0F1115"/>
-          <w:kern w:val="0"/>
-          <w:sz w:val="20"/>
-          <w:szCs w:val="20"/>
-          <w:lang w:val="en-US" w:eastAsia="en-GB"/>
-          <w14:ligatures w14:val="none"/>
-        </w:rPr>
-      </w:pPr>
-      <w:r>
-        <w:rPr>
-          <w:rFonts w:ascii="Arial" w:eastAsia="Times New Roman" w:hAnsi="Arial" w:cs="Arial"/>
-          <w:color w:val="0F1115"/>
-          <w:kern w:val="0"/>
-          <w:sz w:val="20"/>
-          <w:szCs w:val="20"/>
-          <w:lang w:val="en-US" w:eastAsia="en-GB"/>
-          <w14:ligatures w14:val="none"/>
-        </w:rPr>
-        <w:pict w14:anchorId="6C423DFB">
-          <v:rect id="_x0000_i1028" style="width:0;height:1.5pt" o:hralign="center" o:hrstd="t" o:hr="t" fillcolor="#a0a0a0" stroked="f"/>
-        </w:pict>
+        <w:jc w:val="both"/>
+        <w:rPr>
+          <w:rFonts w:ascii="Arial" w:eastAsia="Times New Roman" w:hAnsi="Arial" w:cs="Arial"/>
+          <w:color w:val="0F1115"/>
+          <w:kern w:val="0"/>
+          <w:sz w:val="24"/>
+          <w:szCs w:val="24"/>
+          <w:lang w:val="en-US" w:eastAsia="en-GB"/>
+          <w14:ligatures w14:val="none"/>
+        </w:rPr>
+      </w:pPr>
+      <w:r>
+        <w:rPr>
+          <w:rFonts w:ascii="Arial" w:eastAsia="Times New Roman" w:hAnsi="Arial" w:cs="Arial"/>
+          <w:b/>
+          <w:bCs/>
+          <w:i/>
+          <w:iCs/>
+          <w:color w:val="0F1115"/>
+          <w:kern w:val="0"/>
+          <w:sz w:val="24"/>
+          <w:szCs w:val="24"/>
+          <w:lang w:val="en-US" w:eastAsia="en-GB"/>
+          <w14:ligatures w14:val="none"/>
+        </w:rPr>
+        <w:t>What it does:</w:t>
+      </w:r>
+      <w:r>
+        <w:rPr>
+          <w:rFonts w:ascii="Arial" w:eastAsia="Times New Roman" w:hAnsi="Arial" w:cs="Arial"/>
+          <w:color w:val="0F1115"/>
+          <w:kern w:val="0"/>
+          <w:sz w:val="24"/>
+          <w:szCs w:val="24"/>
+          <w:lang w:val="en-US" w:eastAsia="en-GB"/>
+          <w14:ligatures w14:val="none"/>
+        </w:rPr>
+        <w:t> Every message has a fixed sync word, length, type byte, payload, and CRC16-CCITT so the PC and ESP32 stay aligned even if bytes are lost briefly.</w:t>
       </w:r>
     </w:p>
     <w:p>
@@ -13548,6 +13452,7 @@
         </w:tabs>
         <w:wordWrap w:val="0"/>
         <w:spacing w:after="0" w:line="330" w:lineRule="atLeast"/>
+        <w:jc w:val="both"/>
         <w:rPr>
           <w:rFonts w:ascii="Arial" w:eastAsia="Times New Roman" w:hAnsi="Arial" w:cs="Arial"/>
           <w:color w:val="0F1115"/>
@@ -13563,14 +13468,54 @@
           <w:rFonts w:ascii="Arial" w:eastAsia="Times New Roman" w:hAnsi="Arial" w:cs="Arial"/>
           <w:b/>
           <w:bCs/>
-          <w:color w:val="0F1115"/>
-          <w:kern w:val="0"/>
-          <w:sz w:val="24"/>
-          <w:szCs w:val="24"/>
-          <w:lang w:val="en-US" w:eastAsia="en-GB"/>
-          <w14:ligatures w14:val="none"/>
-        </w:rPr>
-        <w:t>Example 4 — Full local pipeline on the PC (Python)</w:t>
+          <w:i/>
+          <w:iCs/>
+          <w:color w:val="0F1115"/>
+          <w:kern w:val="0"/>
+          <w:sz w:val="24"/>
+          <w:szCs w:val="24"/>
+          <w:lang w:val="en-US" w:eastAsia="en-GB"/>
+          <w14:ligatures w14:val="none"/>
+        </w:rPr>
+        <w:t>Why it is needed:</w:t>
+      </w:r>
+      <w:r>
+        <w:rPr>
+          <w:rFonts w:ascii="Arial" w:eastAsia="Times New Roman" w:hAnsi="Arial" w:cs="Arial"/>
+          <w:color w:val="0F1115"/>
+          <w:kern w:val="0"/>
+          <w:sz w:val="24"/>
+          <w:szCs w:val="24"/>
+          <w:lang w:val="en-US" w:eastAsia="en-GB"/>
+          <w14:ligatures w14:val="none"/>
+        </w:rPr>
+        <w:t xml:space="preserve"> Raw serial bytes would be fragile at 921600 baud with audio traffic. </w:t>
+      </w:r>
+      <w:proofErr w:type="gramStart"/>
+      <w:r>
+        <w:rPr>
+          <w:rFonts w:ascii="Arial" w:eastAsia="Times New Roman" w:hAnsi="Arial" w:cs="Arial"/>
+          <w:color w:val="0F1115"/>
+          <w:kern w:val="0"/>
+          <w:sz w:val="24"/>
+          <w:szCs w:val="24"/>
+          <w:lang w:val="en-US" w:eastAsia="en-GB"/>
+          <w14:ligatures w14:val="none"/>
+        </w:rPr>
+        <w:t>Framing</w:t>
+      </w:r>
+      <w:proofErr w:type="gramEnd"/>
+      <w:r>
+        <w:rPr>
+          <w:rFonts w:ascii="Arial" w:eastAsia="Times New Roman" w:hAnsi="Arial" w:cs="Arial"/>
+          <w:color w:val="0F1115"/>
+          <w:kern w:val="0"/>
+          <w:sz w:val="24"/>
+          <w:szCs w:val="24"/>
+          <w:lang w:val="en-US" w:eastAsia="en-GB"/>
+          <w14:ligatures w14:val="none"/>
+        </w:rPr>
+        <w:t xml:space="preserve"> is part of a reliable course demo and works together with AES on audio and sensor payloads.</w:t>
       </w:r>
     </w:p>
     <w:p>
@@ -13615,34 +13560,9 @@
           <w:lang w:val="en-US" w:eastAsia="en-GB"/>
           <w14:ligatures w14:val="none"/>
         </w:rPr>
-        <w:lastRenderedPageBreak/>
-        <w:t xml:space="preserve">def </w:t>
-      </w:r>
-      <w:proofErr w:type="gramStart"/>
-      <w:r>
-        <w:rPr>
-          <w:rFonts w:ascii="Arial" w:eastAsia="Times New Roman" w:hAnsi="Arial" w:cs="Arial"/>
-          <w:color w:val="0F1115"/>
-          <w:kern w:val="0"/>
-          <w:sz w:val="20"/>
-          <w:szCs w:val="20"/>
-          <w:lang w:val="en-US" w:eastAsia="en-GB"/>
-          <w14:ligatures w14:val="none"/>
-        </w:rPr>
-        <w:t>work(</w:t>
-      </w:r>
-      <w:proofErr w:type="gramEnd"/>
-      <w:r>
-        <w:rPr>
-          <w:rFonts w:ascii="Arial" w:eastAsia="Times New Roman" w:hAnsi="Arial" w:cs="Arial"/>
-          <w:color w:val="0F1115"/>
-          <w:kern w:val="0"/>
-          <w:sz w:val="20"/>
-          <w:szCs w:val="20"/>
-          <w:lang w:val="en-US" w:eastAsia="en-GB"/>
-          <w14:ligatures w14:val="none"/>
-        </w:rPr>
-        <w:t>) -&gt; None:</w:t>
+        <w:pict w14:anchorId="6C423DFB">
+          <v:rect id="_x0000_i1028" style="width:0;height:1.5pt" o:hralign="center" o:hrstd="t" o:hr="t" fillcolor="#a0a0a0" stroked="f"/>
+        </w:pict>
       </w:r>
     </w:p>
     <w:p>
@@ -13671,115 +13591,25 @@
           <w:rFonts w:ascii="Arial" w:eastAsia="Times New Roman" w:hAnsi="Arial" w:cs="Arial"/>
           <w:color w:val="0F1115"/>
           <w:kern w:val="0"/>
-          <w:sz w:val="20"/>
-          <w:szCs w:val="20"/>
-          <w:lang w:val="en-US" w:eastAsia="en-GB"/>
-          <w14:ligatures w14:val="none"/>
-        </w:rPr>
-      </w:pPr>
-      <w:r>
-        <w:rPr>
-          <w:rFonts w:ascii="Arial" w:eastAsia="Times New Roman" w:hAnsi="Arial" w:cs="Arial"/>
-          <w:color w:val="0F1115"/>
-          <w:kern w:val="0"/>
-          <w:sz w:val="20"/>
-          <w:szCs w:val="20"/>
-          <w:lang w:val="en-US" w:eastAsia="en-GB"/>
-          <w14:ligatures w14:val="none"/>
-        </w:rPr>
-        <w:t xml:space="preserve">    </w:t>
-      </w:r>
-      <w:proofErr w:type="spellStart"/>
-      <w:r>
-        <w:rPr>
-          <w:rFonts w:ascii="Arial" w:eastAsia="Times New Roman" w:hAnsi="Arial" w:cs="Arial"/>
-          <w:color w:val="0F1115"/>
-          <w:kern w:val="0"/>
-          <w:sz w:val="20"/>
-          <w:szCs w:val="20"/>
-          <w:lang w:val="en-US" w:eastAsia="en-GB"/>
-          <w14:ligatures w14:val="none"/>
-        </w:rPr>
-        <w:t>pcm</w:t>
-      </w:r>
-      <w:proofErr w:type="spellEnd"/>
-      <w:r>
-        <w:rPr>
-          <w:rFonts w:ascii="Arial" w:eastAsia="Times New Roman" w:hAnsi="Arial" w:cs="Arial"/>
-          <w:color w:val="0F1115"/>
-          <w:kern w:val="0"/>
-          <w:sz w:val="20"/>
-          <w:szCs w:val="20"/>
-          <w:lang w:val="en-US" w:eastAsia="en-GB"/>
-          <w14:ligatures w14:val="none"/>
-        </w:rPr>
-        <w:t xml:space="preserve"> = </w:t>
-      </w:r>
-      <w:proofErr w:type="spellStart"/>
-      <w:proofErr w:type="gramStart"/>
-      <w:r>
-        <w:rPr>
-          <w:rFonts w:ascii="Arial" w:eastAsia="Times New Roman" w:hAnsi="Arial" w:cs="Arial"/>
-          <w:color w:val="0F1115"/>
-          <w:kern w:val="0"/>
-          <w:sz w:val="20"/>
-          <w:szCs w:val="20"/>
-          <w:lang w:val="en-US" w:eastAsia="en-GB"/>
-          <w14:ligatures w14:val="none"/>
-        </w:rPr>
-        <w:t>self.bridge</w:t>
-      </w:r>
-      <w:proofErr w:type="gramEnd"/>
-      <w:r>
-        <w:rPr>
-          <w:rFonts w:ascii="Arial" w:eastAsia="Times New Roman" w:hAnsi="Arial" w:cs="Arial"/>
-          <w:color w:val="0F1115"/>
-          <w:kern w:val="0"/>
-          <w:sz w:val="20"/>
-          <w:szCs w:val="20"/>
-          <w:lang w:val="en-US" w:eastAsia="en-GB"/>
-          <w14:ligatures w14:val="none"/>
-        </w:rPr>
-        <w:t>.stop_</w:t>
-      </w:r>
-      <w:proofErr w:type="gramStart"/>
-      <w:r>
-        <w:rPr>
-          <w:rFonts w:ascii="Arial" w:eastAsia="Times New Roman" w:hAnsi="Arial" w:cs="Arial"/>
-          <w:color w:val="0F1115"/>
-          <w:kern w:val="0"/>
-          <w:sz w:val="20"/>
-          <w:szCs w:val="20"/>
-          <w:lang w:val="en-US" w:eastAsia="en-GB"/>
-          <w14:ligatures w14:val="none"/>
-        </w:rPr>
-        <w:t>recording</w:t>
-      </w:r>
-      <w:proofErr w:type="spellEnd"/>
-      <w:r>
-        <w:rPr>
-          <w:rFonts w:ascii="Arial" w:eastAsia="Times New Roman" w:hAnsi="Arial" w:cs="Arial"/>
-          <w:color w:val="0F1115"/>
-          <w:kern w:val="0"/>
-          <w:sz w:val="20"/>
-          <w:szCs w:val="20"/>
-          <w:lang w:val="en-US" w:eastAsia="en-GB"/>
-          <w14:ligatures w14:val="none"/>
-        </w:rPr>
-        <w:t>(</w:t>
-      </w:r>
-      <w:proofErr w:type="gramEnd"/>
-      <w:r>
-        <w:rPr>
-          <w:rFonts w:ascii="Arial" w:eastAsia="Times New Roman" w:hAnsi="Arial" w:cs="Arial"/>
-          <w:color w:val="0F1115"/>
-          <w:kern w:val="0"/>
-          <w:sz w:val="20"/>
-          <w:szCs w:val="20"/>
-          <w:lang w:val="en-US" w:eastAsia="en-GB"/>
-          <w14:ligatures w14:val="none"/>
-        </w:rPr>
-        <w:t>)</w:t>
+          <w:sz w:val="24"/>
+          <w:szCs w:val="24"/>
+          <w:lang w:val="en-US" w:eastAsia="en-GB"/>
+          <w14:ligatures w14:val="none"/>
+        </w:rPr>
+      </w:pPr>
+      <w:r>
+        <w:rPr>
+          <w:rFonts w:ascii="Arial" w:eastAsia="Times New Roman" w:hAnsi="Arial" w:cs="Arial"/>
+          <w:b/>
+          <w:bCs/>
+          <w:color w:val="0F1115"/>
+          <w:kern w:val="0"/>
+          <w:sz w:val="24"/>
+          <w:szCs w:val="24"/>
+          <w:lang w:val="en-US" w:eastAsia="en-GB"/>
+          <w14:ligatures w14:val="none"/>
+        </w:rPr>
+        <w:t>Example 4 — Full local pipeline on the PC (Python)</w:t>
       </w:r>
     </w:p>
     <w:p>
@@ -13824,7 +13654,7 @@
           <w:lang w:val="en-US" w:eastAsia="en-GB"/>
           <w14:ligatures w14:val="none"/>
         </w:rPr>
-        <w:t xml:space="preserve">    vitals = </w:t>
+        <w:t xml:space="preserve">def </w:t>
       </w:r>
       <w:proofErr w:type="gramStart"/>
       <w:r>
@@ -13837,9 +13667,8 @@
           <w:lang w:val="en-US" w:eastAsia="en-GB"/>
           <w14:ligatures w14:val="none"/>
         </w:rPr>
-        <w:t>self._</w:t>
-      </w:r>
-      <w:proofErr w:type="spellStart"/>
+        <w:t>work(</w:t>
+      </w:r>
       <w:proofErr w:type="gramEnd"/>
       <w:r>
         <w:rPr>
@@ -13851,140 +13680,7 @@
           <w:lang w:val="en-US" w:eastAsia="en-GB"/>
           <w14:ligatures w14:val="none"/>
         </w:rPr>
-        <w:t>measured_vitals</w:t>
-      </w:r>
-      <w:proofErr w:type="spellEnd"/>
-      <w:r>
-        <w:rPr>
-          <w:rFonts w:ascii="Arial" w:eastAsia="Times New Roman" w:hAnsi="Arial" w:cs="Arial"/>
-          <w:color w:val="0F1115"/>
-          <w:kern w:val="0"/>
-          <w:sz w:val="20"/>
-          <w:szCs w:val="20"/>
-          <w:lang w:val="en-US" w:eastAsia="en-GB"/>
-          <w14:ligatures w14:val="none"/>
-        </w:rPr>
-        <w:t xml:space="preserve"> if </w:t>
-      </w:r>
-      <w:proofErr w:type="gramStart"/>
-      <w:r>
-        <w:rPr>
-          <w:rFonts w:ascii="Arial" w:eastAsia="Times New Roman" w:hAnsi="Arial" w:cs="Arial"/>
-          <w:color w:val="0F1115"/>
-          <w:kern w:val="0"/>
-          <w:sz w:val="20"/>
-          <w:szCs w:val="20"/>
-          <w:lang w:val="en-US" w:eastAsia="en-GB"/>
-          <w14:ligatures w14:val="none"/>
-        </w:rPr>
-        <w:t>self._</w:t>
-      </w:r>
-      <w:proofErr w:type="spellStart"/>
-      <w:proofErr w:type="gramEnd"/>
-      <w:r>
-        <w:rPr>
-          <w:rFonts w:ascii="Arial" w:eastAsia="Times New Roman" w:hAnsi="Arial" w:cs="Arial"/>
-          <w:color w:val="0F1115"/>
-          <w:kern w:val="0"/>
-          <w:sz w:val="20"/>
-          <w:szCs w:val="20"/>
-          <w:lang w:val="en-US" w:eastAsia="en-GB"/>
-          <w14:ligatures w14:val="none"/>
-        </w:rPr>
-        <w:t>measured_</w:t>
-      </w:r>
-      <w:proofErr w:type="gramStart"/>
-      <w:r>
-        <w:rPr>
-          <w:rFonts w:ascii="Arial" w:eastAsia="Times New Roman" w:hAnsi="Arial" w:cs="Arial"/>
-          <w:color w:val="0F1115"/>
-          <w:kern w:val="0"/>
-          <w:sz w:val="20"/>
-          <w:szCs w:val="20"/>
-          <w:lang w:val="en-US" w:eastAsia="en-GB"/>
-          <w14:ligatures w14:val="none"/>
-        </w:rPr>
-        <w:t>vitals.valid</w:t>
-      </w:r>
-      <w:proofErr w:type="spellEnd"/>
-      <w:proofErr w:type="gramEnd"/>
-      <w:r>
-        <w:rPr>
-          <w:rFonts w:ascii="Arial" w:eastAsia="Times New Roman" w:hAnsi="Arial" w:cs="Arial"/>
-          <w:color w:val="0F1115"/>
-          <w:kern w:val="0"/>
-          <w:sz w:val="20"/>
-          <w:szCs w:val="20"/>
-          <w:lang w:val="en-US" w:eastAsia="en-GB"/>
-          <w14:ligatures w14:val="none"/>
-        </w:rPr>
-        <w:t xml:space="preserve"> else </w:t>
-      </w:r>
-      <w:proofErr w:type="spellStart"/>
-      <w:proofErr w:type="gramStart"/>
-      <w:r>
-        <w:rPr>
-          <w:rFonts w:ascii="Arial" w:eastAsia="Times New Roman" w:hAnsi="Arial" w:cs="Arial"/>
-          <w:color w:val="0F1115"/>
-          <w:kern w:val="0"/>
-          <w:sz w:val="20"/>
-          <w:szCs w:val="20"/>
-          <w:lang w:val="en-US" w:eastAsia="en-GB"/>
-          <w14:ligatures w14:val="none"/>
-        </w:rPr>
-        <w:t>self.bridge</w:t>
-      </w:r>
-      <w:proofErr w:type="gramEnd"/>
-      <w:r>
-        <w:rPr>
-          <w:rFonts w:ascii="Arial" w:eastAsia="Times New Roman" w:hAnsi="Arial" w:cs="Arial"/>
-          <w:color w:val="0F1115"/>
-          <w:kern w:val="0"/>
-          <w:sz w:val="20"/>
-          <w:szCs w:val="20"/>
-          <w:lang w:val="en-US" w:eastAsia="en-GB"/>
-          <w14:ligatures w14:val="none"/>
-        </w:rPr>
-        <w:t>.last_</w:t>
-      </w:r>
-      <w:proofErr w:type="gramStart"/>
-      <w:r>
-        <w:rPr>
-          <w:rFonts w:ascii="Arial" w:eastAsia="Times New Roman" w:hAnsi="Arial" w:cs="Arial"/>
-          <w:color w:val="0F1115"/>
-          <w:kern w:val="0"/>
-          <w:sz w:val="20"/>
-          <w:szCs w:val="20"/>
-          <w:lang w:val="en-US" w:eastAsia="en-GB"/>
-          <w14:ligatures w14:val="none"/>
-        </w:rPr>
-        <w:t>vitals</w:t>
-      </w:r>
-      <w:proofErr w:type="spellEnd"/>
-      <w:r>
-        <w:rPr>
-          <w:rFonts w:ascii="Arial" w:eastAsia="Times New Roman" w:hAnsi="Arial" w:cs="Arial"/>
-          <w:color w:val="0F1115"/>
-          <w:kern w:val="0"/>
-          <w:sz w:val="20"/>
-          <w:szCs w:val="20"/>
-          <w:lang w:val="en-US" w:eastAsia="en-GB"/>
-          <w14:ligatures w14:val="none"/>
-        </w:rPr>
-        <w:t>(</w:t>
-      </w:r>
-      <w:proofErr w:type="gramEnd"/>
-      <w:r>
-        <w:rPr>
-          <w:rFonts w:ascii="Arial" w:eastAsia="Times New Roman" w:hAnsi="Arial" w:cs="Arial"/>
-          <w:color w:val="0F1115"/>
-          <w:kern w:val="0"/>
-          <w:sz w:val="20"/>
-          <w:szCs w:val="20"/>
-          <w:lang w:val="en-US" w:eastAsia="en-GB"/>
-          <w14:ligatures w14:val="none"/>
-        </w:rPr>
-        <w:t>)</w:t>
+        <w:t>) -&gt; None:</w:t>
       </w:r>
     </w:p>
     <w:p>
@@ -14029,7 +13725,33 @@
           <w:lang w:val="en-US" w:eastAsia="en-GB"/>
           <w14:ligatures w14:val="none"/>
         </w:rPr>
-        <w:t xml:space="preserve">    text = </w:t>
+        <w:t xml:space="preserve">    </w:t>
+      </w:r>
+      <w:proofErr w:type="spellStart"/>
+      <w:r>
+        <w:rPr>
+          <w:rFonts w:ascii="Arial" w:eastAsia="Times New Roman" w:hAnsi="Arial" w:cs="Arial"/>
+          <w:color w:val="0F1115"/>
+          <w:kern w:val="0"/>
+          <w:sz w:val="20"/>
+          <w:szCs w:val="20"/>
+          <w:lang w:val="en-US" w:eastAsia="en-GB"/>
+          <w14:ligatures w14:val="none"/>
+        </w:rPr>
+        <w:t>pcm</w:t>
+      </w:r>
+      <w:proofErr w:type="spellEnd"/>
+      <w:r>
+        <w:rPr>
+          <w:rFonts w:ascii="Arial" w:eastAsia="Times New Roman" w:hAnsi="Arial" w:cs="Arial"/>
+          <w:color w:val="0F1115"/>
+          <w:kern w:val="0"/>
+          <w:sz w:val="20"/>
+          <w:szCs w:val="20"/>
+          <w:lang w:val="en-US" w:eastAsia="en-GB"/>
+          <w14:ligatures w14:val="none"/>
+        </w:rPr>
+        <w:t xml:space="preserve"> = </w:t>
       </w:r>
       <w:proofErr w:type="spellStart"/>
       <w:proofErr w:type="gramStart"/>
@@ -14043,9 +13765,47 @@
           <w:lang w:val="en-US" w:eastAsia="en-GB"/>
           <w14:ligatures w14:val="none"/>
         </w:rPr>
-        <w:t>stt.transcribe</w:t>
+        <w:t>self.bridge</w:t>
+      </w:r>
+      <w:proofErr w:type="gramEnd"/>
+      <w:r>
+        <w:rPr>
+          <w:rFonts w:ascii="Arial" w:eastAsia="Times New Roman" w:hAnsi="Arial" w:cs="Arial"/>
+          <w:color w:val="0F1115"/>
+          <w:kern w:val="0"/>
+          <w:sz w:val="20"/>
+          <w:szCs w:val="20"/>
+          <w:lang w:val="en-US" w:eastAsia="en-GB"/>
+          <w14:ligatures w14:val="none"/>
+        </w:rPr>
+        <w:t>.stop_</w:t>
+      </w:r>
+      <w:proofErr w:type="gramStart"/>
+      <w:r>
+        <w:rPr>
+          <w:rFonts w:ascii="Arial" w:eastAsia="Times New Roman" w:hAnsi="Arial" w:cs="Arial"/>
+          <w:color w:val="0F1115"/>
+          <w:kern w:val="0"/>
+          <w:sz w:val="20"/>
+          <w:szCs w:val="20"/>
+          <w:lang w:val="en-US" w:eastAsia="en-GB"/>
+          <w14:ligatures w14:val="none"/>
+        </w:rPr>
+        <w:t>recording</w:t>
       </w:r>
       <w:proofErr w:type="spellEnd"/>
+      <w:r>
+        <w:rPr>
+          <w:rFonts w:ascii="Arial" w:eastAsia="Times New Roman" w:hAnsi="Arial" w:cs="Arial"/>
+          <w:color w:val="0F1115"/>
+          <w:kern w:val="0"/>
+          <w:sz w:val="20"/>
+          <w:szCs w:val="20"/>
+          <w:lang w:val="en-US" w:eastAsia="en-GB"/>
+          <w14:ligatures w14:val="none"/>
+        </w:rPr>
+        <w:t>(</w:t>
+      </w:r>
       <w:proofErr w:type="gramEnd"/>
       <w:r>
         <w:rPr>
@@ -14057,33 +13817,7 @@
           <w:lang w:val="en-US" w:eastAsia="en-GB"/>
           <w14:ligatures w14:val="none"/>
         </w:rPr>
-        <w:t>(</w:t>
-      </w:r>
-      <w:proofErr w:type="spellStart"/>
-      <w:r>
-        <w:rPr>
-          <w:rFonts w:ascii="Arial" w:eastAsia="Times New Roman" w:hAnsi="Arial" w:cs="Arial"/>
-          <w:color w:val="0F1115"/>
-          <w:kern w:val="0"/>
-          <w:sz w:val="20"/>
-          <w:szCs w:val="20"/>
-          <w:lang w:val="en-US" w:eastAsia="en-GB"/>
-          <w14:ligatures w14:val="none"/>
-        </w:rPr>
-        <w:t>pcm</w:t>
-      </w:r>
-      <w:proofErr w:type="spellEnd"/>
-      <w:r>
-        <w:rPr>
-          <w:rFonts w:ascii="Arial" w:eastAsia="Times New Roman" w:hAnsi="Arial" w:cs="Arial"/>
-          <w:color w:val="0F1115"/>
-          <w:kern w:val="0"/>
-          <w:sz w:val="20"/>
-          <w:szCs w:val="20"/>
-          <w:lang w:val="en-US" w:eastAsia="en-GB"/>
-          <w14:ligatures w14:val="none"/>
-        </w:rPr>
-        <w:t>) or "I need first aid help"</w:t>
+        <w:t>)</w:t>
       </w:r>
     </w:p>
     <w:p>
@@ -14128,7 +13862,101 @@
           <w:lang w:val="en-US" w:eastAsia="en-GB"/>
           <w14:ligatures w14:val="none"/>
         </w:rPr>
-        <w:t xml:space="preserve">    reply = </w:t>
+        <w:t xml:space="preserve">    vitals = </w:t>
+      </w:r>
+      <w:proofErr w:type="gramStart"/>
+      <w:r>
+        <w:rPr>
+          <w:rFonts w:ascii="Arial" w:eastAsia="Times New Roman" w:hAnsi="Arial" w:cs="Arial"/>
+          <w:color w:val="0F1115"/>
+          <w:kern w:val="0"/>
+          <w:sz w:val="20"/>
+          <w:szCs w:val="20"/>
+          <w:lang w:val="en-US" w:eastAsia="en-GB"/>
+          <w14:ligatures w14:val="none"/>
+        </w:rPr>
+        <w:t>self._</w:t>
+      </w:r>
+      <w:proofErr w:type="spellStart"/>
+      <w:proofErr w:type="gramEnd"/>
+      <w:r>
+        <w:rPr>
+          <w:rFonts w:ascii="Arial" w:eastAsia="Times New Roman" w:hAnsi="Arial" w:cs="Arial"/>
+          <w:color w:val="0F1115"/>
+          <w:kern w:val="0"/>
+          <w:sz w:val="20"/>
+          <w:szCs w:val="20"/>
+          <w:lang w:val="en-US" w:eastAsia="en-GB"/>
+          <w14:ligatures w14:val="none"/>
+        </w:rPr>
+        <w:t>measured_vitals</w:t>
+      </w:r>
+      <w:proofErr w:type="spellEnd"/>
+      <w:r>
+        <w:rPr>
+          <w:rFonts w:ascii="Arial" w:eastAsia="Times New Roman" w:hAnsi="Arial" w:cs="Arial"/>
+          <w:color w:val="0F1115"/>
+          <w:kern w:val="0"/>
+          <w:sz w:val="20"/>
+          <w:szCs w:val="20"/>
+          <w:lang w:val="en-US" w:eastAsia="en-GB"/>
+          <w14:ligatures w14:val="none"/>
+        </w:rPr>
+        <w:t xml:space="preserve"> if </w:t>
+      </w:r>
+      <w:proofErr w:type="gramStart"/>
+      <w:r>
+        <w:rPr>
+          <w:rFonts w:ascii="Arial" w:eastAsia="Times New Roman" w:hAnsi="Arial" w:cs="Arial"/>
+          <w:color w:val="0F1115"/>
+          <w:kern w:val="0"/>
+          <w:sz w:val="20"/>
+          <w:szCs w:val="20"/>
+          <w:lang w:val="en-US" w:eastAsia="en-GB"/>
+          <w14:ligatures w14:val="none"/>
+        </w:rPr>
+        <w:t>self._</w:t>
+      </w:r>
+      <w:proofErr w:type="spellStart"/>
+      <w:proofErr w:type="gramEnd"/>
+      <w:r>
+        <w:rPr>
+          <w:rFonts w:ascii="Arial" w:eastAsia="Times New Roman" w:hAnsi="Arial" w:cs="Arial"/>
+          <w:color w:val="0F1115"/>
+          <w:kern w:val="0"/>
+          <w:sz w:val="20"/>
+          <w:szCs w:val="20"/>
+          <w:lang w:val="en-US" w:eastAsia="en-GB"/>
+          <w14:ligatures w14:val="none"/>
+        </w:rPr>
+        <w:t>measured_</w:t>
+      </w:r>
+      <w:proofErr w:type="gramStart"/>
+      <w:r>
+        <w:rPr>
+          <w:rFonts w:ascii="Arial" w:eastAsia="Times New Roman" w:hAnsi="Arial" w:cs="Arial"/>
+          <w:color w:val="0F1115"/>
+          <w:kern w:val="0"/>
+          <w:sz w:val="20"/>
+          <w:szCs w:val="20"/>
+          <w:lang w:val="en-US" w:eastAsia="en-GB"/>
+          <w14:ligatures w14:val="none"/>
+        </w:rPr>
+        <w:t>vitals.valid</w:t>
+      </w:r>
+      <w:proofErr w:type="spellEnd"/>
+      <w:proofErr w:type="gramEnd"/>
+      <w:r>
+        <w:rPr>
+          <w:rFonts w:ascii="Arial" w:eastAsia="Times New Roman" w:hAnsi="Arial" w:cs="Arial"/>
+          <w:color w:val="0F1115"/>
+          <w:kern w:val="0"/>
+          <w:sz w:val="20"/>
+          <w:szCs w:val="20"/>
+          <w:lang w:val="en-US" w:eastAsia="en-GB"/>
+          <w14:ligatures w14:val="none"/>
+        </w:rPr>
+        <w:t xml:space="preserve"> else </w:t>
       </w:r>
       <w:proofErr w:type="spellStart"/>
       <w:proofErr w:type="gramStart"/>
@@ -14142,9 +13970,47 @@
           <w:lang w:val="en-US" w:eastAsia="en-GB"/>
           <w14:ligatures w14:val="none"/>
         </w:rPr>
-        <w:t>llm.generate</w:t>
+        <w:t>self.bridge</w:t>
+      </w:r>
+      <w:proofErr w:type="gramEnd"/>
+      <w:r>
+        <w:rPr>
+          <w:rFonts w:ascii="Arial" w:eastAsia="Times New Roman" w:hAnsi="Arial" w:cs="Arial"/>
+          <w:color w:val="0F1115"/>
+          <w:kern w:val="0"/>
+          <w:sz w:val="20"/>
+          <w:szCs w:val="20"/>
+          <w:lang w:val="en-US" w:eastAsia="en-GB"/>
+          <w14:ligatures w14:val="none"/>
+        </w:rPr>
+        <w:t>.last_</w:t>
+      </w:r>
+      <w:proofErr w:type="gramStart"/>
+      <w:r>
+        <w:rPr>
+          <w:rFonts w:ascii="Arial" w:eastAsia="Times New Roman" w:hAnsi="Arial" w:cs="Arial"/>
+          <w:color w:val="0F1115"/>
+          <w:kern w:val="0"/>
+          <w:sz w:val="20"/>
+          <w:szCs w:val="20"/>
+          <w:lang w:val="en-US" w:eastAsia="en-GB"/>
+          <w14:ligatures w14:val="none"/>
+        </w:rPr>
+        <w:t>vitals</w:t>
       </w:r>
       <w:proofErr w:type="spellEnd"/>
+      <w:r>
+        <w:rPr>
+          <w:rFonts w:ascii="Arial" w:eastAsia="Times New Roman" w:hAnsi="Arial" w:cs="Arial"/>
+          <w:color w:val="0F1115"/>
+          <w:kern w:val="0"/>
+          <w:sz w:val="20"/>
+          <w:szCs w:val="20"/>
+          <w:lang w:val="en-US" w:eastAsia="en-GB"/>
+          <w14:ligatures w14:val="none"/>
+        </w:rPr>
+        <w:t>(</w:t>
+      </w:r>
       <w:proofErr w:type="gramEnd"/>
       <w:r>
         <w:rPr>
@@ -14156,7 +14022,7 @@
           <w:lang w:val="en-US" w:eastAsia="en-GB"/>
           <w14:ligatures w14:val="none"/>
         </w:rPr>
-        <w:t>(text, vitals)</w:t>
+        <w:t>)</w:t>
       </w:r>
     </w:p>
     <w:p>
@@ -14201,7 +14067,7 @@
           <w:lang w:val="en-US" w:eastAsia="en-GB"/>
           <w14:ligatures w14:val="none"/>
         </w:rPr>
-        <w:t xml:space="preserve">    for chunk in </w:t>
+        <w:t xml:space="preserve">    text = </w:t>
       </w:r>
       <w:proofErr w:type="spellStart"/>
       <w:proofErr w:type="gramStart"/>
@@ -14215,8 +14081,9 @@
           <w:lang w:val="en-US" w:eastAsia="en-GB"/>
           <w14:ligatures w14:val="none"/>
         </w:rPr>
-        <w:t>tts.synthesize</w:t>
-      </w:r>
+        <w:t>stt.transcribe</w:t>
+      </w:r>
+      <w:proofErr w:type="spellEnd"/>
       <w:proofErr w:type="gramEnd"/>
       <w:r>
         <w:rPr>
@@ -14228,7 +14095,20 @@
           <w:lang w:val="en-US" w:eastAsia="en-GB"/>
           <w14:ligatures w14:val="none"/>
         </w:rPr>
-        <w:t>_stream</w:t>
+        <w:t>(</w:t>
+      </w:r>
+      <w:proofErr w:type="spellStart"/>
+      <w:r>
+        <w:rPr>
+          <w:rFonts w:ascii="Arial" w:eastAsia="Times New Roman" w:hAnsi="Arial" w:cs="Arial"/>
+          <w:color w:val="0F1115"/>
+          <w:kern w:val="0"/>
+          <w:sz w:val="20"/>
+          <w:szCs w:val="20"/>
+          <w:lang w:val="en-US" w:eastAsia="en-GB"/>
+          <w14:ligatures w14:val="none"/>
+        </w:rPr>
+        <w:t>pcm</w:t>
       </w:r>
       <w:proofErr w:type="spellEnd"/>
       <w:r>
@@ -14241,7 +14121,7 @@
           <w:lang w:val="en-US" w:eastAsia="en-GB"/>
           <w14:ligatures w14:val="none"/>
         </w:rPr>
-        <w:t>(reply):</w:t>
+        <w:t>) or "I need first aid help"</w:t>
       </w:r>
     </w:p>
     <w:p>
@@ -14286,7 +14166,7 @@
           <w:lang w:val="en-US" w:eastAsia="en-GB"/>
           <w14:ligatures w14:val="none"/>
         </w:rPr>
-        <w:t xml:space="preserve">        </w:t>
+        <w:t xml:space="preserve">    reply = </w:t>
       </w:r>
       <w:proofErr w:type="spellStart"/>
       <w:proofErr w:type="gramStart"/>
@@ -14300,8 +14180,9 @@
           <w:lang w:val="en-US" w:eastAsia="en-GB"/>
           <w14:ligatures w14:val="none"/>
         </w:rPr>
-        <w:t>self.bridge</w:t>
-      </w:r>
+        <w:t>llm.generate</w:t>
+      </w:r>
+      <w:proofErr w:type="spellEnd"/>
       <w:proofErr w:type="gramEnd"/>
       <w:r>
         <w:rPr>
@@ -14313,20 +14194,7 @@
           <w:lang w:val="en-US" w:eastAsia="en-GB"/>
           <w14:ligatures w14:val="none"/>
         </w:rPr>
-        <w:t>.send_audio_down</w:t>
-      </w:r>
-      <w:proofErr w:type="spellEnd"/>
-      <w:r>
-        <w:rPr>
-          <w:rFonts w:ascii="Arial" w:eastAsia="Times New Roman" w:hAnsi="Arial" w:cs="Arial"/>
-          <w:color w:val="0F1115"/>
-          <w:kern w:val="0"/>
-          <w:sz w:val="20"/>
-          <w:szCs w:val="20"/>
-          <w:lang w:val="en-US" w:eastAsia="en-GB"/>
-          <w14:ligatures w14:val="none"/>
-        </w:rPr>
-        <w:t>(chunk)</w:t>
+        <w:t>(text, vitals)</w:t>
       </w:r>
     </w:p>
     <w:p>
@@ -14371,7 +14239,7 @@
           <w:lang w:val="en-US" w:eastAsia="en-GB"/>
           <w14:ligatures w14:val="none"/>
         </w:rPr>
-        <w:t xml:space="preserve">    </w:t>
+        <w:t xml:space="preserve">    for chunk in </w:t>
       </w:r>
       <w:proofErr w:type="spellStart"/>
       <w:proofErr w:type="gramStart"/>
@@ -14385,7 +14253,7 @@
           <w:lang w:val="en-US" w:eastAsia="en-GB"/>
           <w14:ligatures w14:val="none"/>
         </w:rPr>
-        <w:t>self.bridge</w:t>
+        <w:t>tts.synthesize</w:t>
       </w:r>
       <w:proofErr w:type="gramEnd"/>
       <w:r>
@@ -14398,20 +14266,7 @@
           <w:lang w:val="en-US" w:eastAsia="en-GB"/>
           <w14:ligatures w14:val="none"/>
         </w:rPr>
-        <w:t>.send_playback_</w:t>
-      </w:r>
-      <w:proofErr w:type="gramStart"/>
-      <w:r>
-        <w:rPr>
-          <w:rFonts w:ascii="Arial" w:eastAsia="Times New Roman" w:hAnsi="Arial" w:cs="Arial"/>
-          <w:color w:val="0F1115"/>
-          <w:kern w:val="0"/>
-          <w:sz w:val="20"/>
-          <w:szCs w:val="20"/>
-          <w:lang w:val="en-US" w:eastAsia="en-GB"/>
-          <w14:ligatures w14:val="none"/>
-        </w:rPr>
-        <w:t>end</w:t>
+        <w:t>_stream</w:t>
       </w:r>
       <w:proofErr w:type="spellEnd"/>
       <w:r>
@@ -14424,20 +14279,7 @@
           <w:lang w:val="en-US" w:eastAsia="en-GB"/>
           <w14:ligatures w14:val="none"/>
         </w:rPr>
-        <w:t>(</w:t>
-      </w:r>
-      <w:proofErr w:type="gramEnd"/>
-      <w:r>
-        <w:rPr>
-          <w:rFonts w:ascii="Arial" w:eastAsia="Times New Roman" w:hAnsi="Arial" w:cs="Arial"/>
-          <w:color w:val="0F1115"/>
-          <w:kern w:val="0"/>
-          <w:sz w:val="20"/>
-          <w:szCs w:val="20"/>
-          <w:lang w:val="en-US" w:eastAsia="en-GB"/>
-          <w14:ligatures w14:val="none"/>
-        </w:rPr>
-        <w:t>)</w:t>
+        <w:t>(reply):</w:t>
       </w:r>
     </w:p>
     <w:p>
@@ -14472,6 +14314,58 @@
           <w14:ligatures w14:val="none"/>
         </w:rPr>
       </w:pPr>
+      <w:r>
+        <w:rPr>
+          <w:rFonts w:ascii="Arial" w:eastAsia="Times New Roman" w:hAnsi="Arial" w:cs="Arial"/>
+          <w:color w:val="0F1115"/>
+          <w:kern w:val="0"/>
+          <w:sz w:val="20"/>
+          <w:szCs w:val="20"/>
+          <w:lang w:val="en-US" w:eastAsia="en-GB"/>
+          <w14:ligatures w14:val="none"/>
+        </w:rPr>
+        <w:t xml:space="preserve">        </w:t>
+      </w:r>
+      <w:proofErr w:type="spellStart"/>
+      <w:proofErr w:type="gramStart"/>
+      <w:r>
+        <w:rPr>
+          <w:rFonts w:ascii="Arial" w:eastAsia="Times New Roman" w:hAnsi="Arial" w:cs="Arial"/>
+          <w:color w:val="0F1115"/>
+          <w:kern w:val="0"/>
+          <w:sz w:val="20"/>
+          <w:szCs w:val="20"/>
+          <w:lang w:val="en-US" w:eastAsia="en-GB"/>
+          <w14:ligatures w14:val="none"/>
+        </w:rPr>
+        <w:t>self.bridge</w:t>
+      </w:r>
+      <w:proofErr w:type="gramEnd"/>
+      <w:r>
+        <w:rPr>
+          <w:rFonts w:ascii="Arial" w:eastAsia="Times New Roman" w:hAnsi="Arial" w:cs="Arial"/>
+          <w:color w:val="0F1115"/>
+          <w:kern w:val="0"/>
+          <w:sz w:val="20"/>
+          <w:szCs w:val="20"/>
+          <w:lang w:val="en-US" w:eastAsia="en-GB"/>
+          <w14:ligatures w14:val="none"/>
+        </w:rPr>
+        <w:t>.send_audio_down</w:t>
+      </w:r>
+      <w:proofErr w:type="spellEnd"/>
+      <w:r>
+        <w:rPr>
+          <w:rFonts w:ascii="Arial" w:eastAsia="Times New Roman" w:hAnsi="Arial" w:cs="Arial"/>
+          <w:color w:val="0F1115"/>
+          <w:kern w:val="0"/>
+          <w:sz w:val="20"/>
+          <w:szCs w:val="20"/>
+          <w:lang w:val="en-US" w:eastAsia="en-GB"/>
+          <w14:ligatures w14:val="none"/>
+        </w:rPr>
+        <w:t>(chunk)</w:t>
+      </w:r>
     </w:p>
     <w:p>
       <w:pPr>
@@ -14495,57 +14389,67 @@
         </w:tabs>
         <w:wordWrap w:val="0"/>
         <w:spacing w:after="0" w:line="330" w:lineRule="atLeast"/>
-        <w:jc w:val="both"/>
-        <w:rPr>
-          <w:rFonts w:ascii="Arial" w:eastAsia="Times New Roman" w:hAnsi="Arial" w:cs="Arial"/>
-          <w:color w:val="0F1115"/>
-          <w:kern w:val="0"/>
-          <w:sz w:val="24"/>
-          <w:szCs w:val="24"/>
-          <w:lang w:val="en-US" w:eastAsia="en-GB"/>
-          <w14:ligatures w14:val="none"/>
-        </w:rPr>
-      </w:pPr>
-      <w:r>
-        <w:rPr>
-          <w:rFonts w:ascii="Arial" w:eastAsia="Times New Roman" w:hAnsi="Arial" w:cs="Arial"/>
-          <w:b/>
-          <w:bCs/>
-          <w:i/>
-          <w:iCs/>
-          <w:color w:val="0F1115"/>
-          <w:kern w:val="0"/>
-          <w:sz w:val="24"/>
-          <w:szCs w:val="24"/>
-          <w:lang w:val="en-US" w:eastAsia="en-GB"/>
-          <w14:ligatures w14:val="none"/>
-        </w:rPr>
-        <w:t>What it does:</w:t>
-      </w:r>
-      <w:r>
-        <w:rPr>
-          <w:rFonts w:ascii="Arial" w:eastAsia="Times New Roman" w:hAnsi="Arial" w:cs="Arial"/>
-          <w:color w:val="0F1115"/>
-          <w:kern w:val="0"/>
-          <w:sz w:val="24"/>
-          <w:szCs w:val="24"/>
-          <w:lang w:val="en-US" w:eastAsia="en-GB"/>
-          <w14:ligatures w14:val="none"/>
-        </w:rPr>
-        <w:t xml:space="preserve"> After recording stops, the PC transcribes English speech with Faster-Whisper, asks Llama 3.2 through local </w:t>
+        <w:rPr>
+          <w:rFonts w:ascii="Arial" w:eastAsia="Times New Roman" w:hAnsi="Arial" w:cs="Arial"/>
+          <w:color w:val="0F1115"/>
+          <w:kern w:val="0"/>
+          <w:sz w:val="20"/>
+          <w:szCs w:val="20"/>
+          <w:lang w:val="en-US" w:eastAsia="en-GB"/>
+          <w14:ligatures w14:val="none"/>
+        </w:rPr>
+      </w:pPr>
+      <w:r>
+        <w:rPr>
+          <w:rFonts w:ascii="Arial" w:eastAsia="Times New Roman" w:hAnsi="Arial" w:cs="Arial"/>
+          <w:color w:val="0F1115"/>
+          <w:kern w:val="0"/>
+          <w:sz w:val="20"/>
+          <w:szCs w:val="20"/>
+          <w:lang w:val="en-US" w:eastAsia="en-GB"/>
+          <w14:ligatures w14:val="none"/>
+        </w:rPr>
+        <w:t xml:space="preserve">    </w:t>
       </w:r>
       <w:proofErr w:type="spellStart"/>
-      <w:r>
-        <w:rPr>
-          <w:rFonts w:ascii="Arial" w:eastAsia="Times New Roman" w:hAnsi="Arial" w:cs="Arial"/>
-          <w:color w:val="0F1115"/>
-          <w:kern w:val="0"/>
-          <w:sz w:val="24"/>
-          <w:szCs w:val="24"/>
-          <w:lang w:val="en-US" w:eastAsia="en-GB"/>
-          <w14:ligatures w14:val="none"/>
-        </w:rPr>
-        <w:t>Ollama</w:t>
+      <w:proofErr w:type="gramStart"/>
+      <w:r>
+        <w:rPr>
+          <w:rFonts w:ascii="Arial" w:eastAsia="Times New Roman" w:hAnsi="Arial" w:cs="Arial"/>
+          <w:color w:val="0F1115"/>
+          <w:kern w:val="0"/>
+          <w:sz w:val="20"/>
+          <w:szCs w:val="20"/>
+          <w:lang w:val="en-US" w:eastAsia="en-GB"/>
+          <w14:ligatures w14:val="none"/>
+        </w:rPr>
+        <w:t>self.bridge</w:t>
+      </w:r>
+      <w:proofErr w:type="gramEnd"/>
+      <w:r>
+        <w:rPr>
+          <w:rFonts w:ascii="Arial" w:eastAsia="Times New Roman" w:hAnsi="Arial" w:cs="Arial"/>
+          <w:color w:val="0F1115"/>
+          <w:kern w:val="0"/>
+          <w:sz w:val="20"/>
+          <w:szCs w:val="20"/>
+          <w:lang w:val="en-US" w:eastAsia="en-GB"/>
+          <w14:ligatures w14:val="none"/>
+        </w:rPr>
+        <w:t>.send_playback_</w:t>
+      </w:r>
+      <w:proofErr w:type="gramStart"/>
+      <w:r>
+        <w:rPr>
+          <w:rFonts w:ascii="Arial" w:eastAsia="Times New Roman" w:hAnsi="Arial" w:cs="Arial"/>
+          <w:color w:val="0F1115"/>
+          <w:kern w:val="0"/>
+          <w:sz w:val="20"/>
+          <w:szCs w:val="20"/>
+          <w:lang w:val="en-US" w:eastAsia="en-GB"/>
+          <w14:ligatures w14:val="none"/>
+        </w:rPr>
+        <w:t>end</w:t>
       </w:r>
       <w:proofErr w:type="spellEnd"/>
       <w:r>
@@ -14553,38 +14457,25 @@
           <w:rFonts w:ascii="Arial" w:eastAsia="Times New Roman" w:hAnsi="Arial" w:cs="Arial"/>
           <w:color w:val="0F1115"/>
           <w:kern w:val="0"/>
-          <w:sz w:val="24"/>
-          <w:szCs w:val="24"/>
-          <w:lang w:val="en-US" w:eastAsia="en-GB"/>
-          <w14:ligatures w14:val="none"/>
-        </w:rPr>
-        <w:t xml:space="preserve"> for a short first-aid reply (using stored vitals if available), </w:t>
-      </w:r>
-      <w:proofErr w:type="spellStart"/>
-      <w:r>
-        <w:rPr>
-          <w:rFonts w:ascii="Arial" w:eastAsia="Times New Roman" w:hAnsi="Arial" w:cs="Arial"/>
-          <w:color w:val="0F1115"/>
-          <w:kern w:val="0"/>
-          <w:sz w:val="24"/>
-          <w:szCs w:val="24"/>
-          <w:lang w:val="en-US" w:eastAsia="en-GB"/>
-          <w14:ligatures w14:val="none"/>
-        </w:rPr>
-        <w:t>synthesises</w:t>
-      </w:r>
-      <w:proofErr w:type="spellEnd"/>
-      <w:r>
-        <w:rPr>
-          <w:rFonts w:ascii="Arial" w:eastAsia="Times New Roman" w:hAnsi="Arial" w:cs="Arial"/>
-          <w:color w:val="0F1115"/>
-          <w:kern w:val="0"/>
-          <w:sz w:val="24"/>
-          <w:szCs w:val="24"/>
-          <w:lang w:val="en-US" w:eastAsia="en-GB"/>
-          <w14:ligatures w14:val="none"/>
-        </w:rPr>
-        <w:t xml:space="preserve"> speech with Piper, and sends audio back to the ESP32 for the MAX98357A.</w:t>
+          <w:sz w:val="20"/>
+          <w:szCs w:val="20"/>
+          <w:lang w:val="en-US" w:eastAsia="en-GB"/>
+          <w14:ligatures w14:val="none"/>
+        </w:rPr>
+        <w:t>(</w:t>
+      </w:r>
+      <w:proofErr w:type="gramEnd"/>
+      <w:r>
+        <w:rPr>
+          <w:rFonts w:ascii="Arial" w:eastAsia="Times New Roman" w:hAnsi="Arial" w:cs="Arial"/>
+          <w:color w:val="0F1115"/>
+          <w:kern w:val="0"/>
+          <w:sz w:val="20"/>
+          <w:szCs w:val="20"/>
+          <w:lang w:val="en-US" w:eastAsia="en-GB"/>
+          <w14:ligatures w14:val="none"/>
+        </w:rPr>
+        <w:t>)</w:t>
       </w:r>
     </w:p>
     <w:p>
@@ -14609,45 +14500,16 @@
         </w:tabs>
         <w:wordWrap w:val="0"/>
         <w:spacing w:after="0" w:line="330" w:lineRule="atLeast"/>
-        <w:jc w:val="both"/>
-        <w:rPr>
-          <w:rFonts w:ascii="Arial" w:eastAsia="Times New Roman" w:hAnsi="Arial" w:cs="Arial"/>
-          <w:color w:val="0F1115"/>
-          <w:kern w:val="0"/>
-          <w:sz w:val="24"/>
-          <w:szCs w:val="24"/>
-          <w:lang w:val="en-US" w:eastAsia="en-GB"/>
-          <w14:ligatures w14:val="none"/>
-        </w:rPr>
-      </w:pPr>
-      <w:r>
-        <w:rPr>
-          <w:rFonts w:ascii="Arial" w:eastAsia="Times New Roman" w:hAnsi="Arial" w:cs="Arial"/>
-          <w:b/>
-          <w:bCs/>
-          <w:i/>
-          <w:iCs/>
-          <w:color w:val="0F1115"/>
-          <w:kern w:val="0"/>
-          <w:sz w:val="24"/>
-          <w:szCs w:val="24"/>
-          <w:lang w:val="en-US" w:eastAsia="en-GB"/>
-          <w14:ligatures w14:val="none"/>
-        </w:rPr>
-        <w:t>Why it is needed:</w:t>
-      </w:r>
-      <w:r>
-        <w:rPr>
-          <w:rFonts w:ascii="Arial" w:eastAsia="Times New Roman" w:hAnsi="Arial" w:cs="Arial"/>
-          <w:color w:val="0F1115"/>
-          <w:kern w:val="0"/>
-          <w:sz w:val="24"/>
-          <w:szCs w:val="24"/>
-          <w:lang w:val="en-US" w:eastAsia="en-GB"/>
-          <w14:ligatures w14:val="none"/>
-        </w:rPr>
-        <w:t> This is the core “intelligence” of the project. It replaces template ideas such as energy-based command matching and pre-recorded “light on” clips in flash. The system understands open descriptions (“heavy bleeding,” “choking”) instead of only three fixed commands.</w:t>
-      </w:r>
+        <w:rPr>
+          <w:rFonts w:ascii="Arial" w:eastAsia="Times New Roman" w:hAnsi="Arial" w:cs="Arial"/>
+          <w:color w:val="0F1115"/>
+          <w:kern w:val="0"/>
+          <w:sz w:val="20"/>
+          <w:szCs w:val="20"/>
+          <w:lang w:val="en-US" w:eastAsia="en-GB"/>
+          <w14:ligatures w14:val="none"/>
+        </w:rPr>
+      </w:pPr>
     </w:p>
     <w:p>
       <w:pPr>
@@ -14682,6 +14544,86 @@
           <w14:ligatures w14:val="none"/>
         </w:rPr>
       </w:pPr>
+      <w:r>
+        <w:rPr>
+          <w:rFonts w:ascii="Arial" w:eastAsia="Times New Roman" w:hAnsi="Arial" w:cs="Arial"/>
+          <w:b/>
+          <w:bCs/>
+          <w:i/>
+          <w:iCs/>
+          <w:color w:val="0F1115"/>
+          <w:kern w:val="0"/>
+          <w:sz w:val="24"/>
+          <w:szCs w:val="24"/>
+          <w:lang w:val="en-US" w:eastAsia="en-GB"/>
+          <w14:ligatures w14:val="none"/>
+        </w:rPr>
+        <w:t>What it does:</w:t>
+      </w:r>
+      <w:r>
+        <w:rPr>
+          <w:rFonts w:ascii="Arial" w:eastAsia="Times New Roman" w:hAnsi="Arial" w:cs="Arial"/>
+          <w:color w:val="0F1115"/>
+          <w:kern w:val="0"/>
+          <w:sz w:val="24"/>
+          <w:szCs w:val="24"/>
+          <w:lang w:val="en-US" w:eastAsia="en-GB"/>
+          <w14:ligatures w14:val="none"/>
+        </w:rPr>
+        <w:t xml:space="preserve"> After recording stops, the PC transcribes English speech with Faster-Whisper, asks Llama 3.2 through local </w:t>
+      </w:r>
+      <w:proofErr w:type="spellStart"/>
+      <w:r>
+        <w:rPr>
+          <w:rFonts w:ascii="Arial" w:eastAsia="Times New Roman" w:hAnsi="Arial" w:cs="Arial"/>
+          <w:color w:val="0F1115"/>
+          <w:kern w:val="0"/>
+          <w:sz w:val="24"/>
+          <w:szCs w:val="24"/>
+          <w:lang w:val="en-US" w:eastAsia="en-GB"/>
+          <w14:ligatures w14:val="none"/>
+        </w:rPr>
+        <w:t>Ollama</w:t>
+      </w:r>
+      <w:proofErr w:type="spellEnd"/>
+      <w:r>
+        <w:rPr>
+          <w:rFonts w:ascii="Arial" w:eastAsia="Times New Roman" w:hAnsi="Arial" w:cs="Arial"/>
+          <w:color w:val="0F1115"/>
+          <w:kern w:val="0"/>
+          <w:sz w:val="24"/>
+          <w:szCs w:val="24"/>
+          <w:lang w:val="en-US" w:eastAsia="en-GB"/>
+          <w14:ligatures w14:val="none"/>
+        </w:rPr>
+        <w:t xml:space="preserve"> for a short first-aid reply (using stored vitals if available), </w:t>
+      </w:r>
+      <w:proofErr w:type="spellStart"/>
+      <w:r>
+        <w:rPr>
+          <w:rFonts w:ascii="Arial" w:eastAsia="Times New Roman" w:hAnsi="Arial" w:cs="Arial"/>
+          <w:color w:val="0F1115"/>
+          <w:kern w:val="0"/>
+          <w:sz w:val="24"/>
+          <w:szCs w:val="24"/>
+          <w:lang w:val="en-US" w:eastAsia="en-GB"/>
+          <w14:ligatures w14:val="none"/>
+        </w:rPr>
+        <w:t>synthesises</w:t>
+      </w:r>
+      <w:proofErr w:type="spellEnd"/>
+      <w:r>
+        <w:rPr>
+          <w:rFonts w:ascii="Arial" w:eastAsia="Times New Roman" w:hAnsi="Arial" w:cs="Arial"/>
+          <w:color w:val="0F1115"/>
+          <w:kern w:val="0"/>
+          <w:sz w:val="24"/>
+          <w:szCs w:val="24"/>
+          <w:lang w:val="en-US" w:eastAsia="en-GB"/>
+          <w14:ligatures w14:val="none"/>
+        </w:rPr>
+        <w:t xml:space="preserve"> speech with Piper, and sends audio back to the ESP32 for the MAX98357A.</w:t>
+      </w:r>
     </w:p>
     <w:p>
       <w:pPr>
@@ -14721,14 +14663,28 @@
           <w:rFonts w:ascii="Arial" w:eastAsia="Times New Roman" w:hAnsi="Arial" w:cs="Arial"/>
           <w:b/>
           <w:bCs/>
-          <w:color w:val="0F1115"/>
-          <w:kern w:val="0"/>
-          <w:sz w:val="24"/>
-          <w:szCs w:val="24"/>
-          <w:lang w:val="en-US" w:eastAsia="en-GB"/>
-          <w14:ligatures w14:val="none"/>
-        </w:rPr>
-        <w:t>What we do not implement (template vs our project)</w:t>
+          <w:i/>
+          <w:iCs/>
+          <w:color w:val="0F1115"/>
+          <w:kern w:val="0"/>
+          <w:sz w:val="24"/>
+          <w:szCs w:val="24"/>
+          <w:lang w:val="en-US" w:eastAsia="en-GB"/>
+          <w14:ligatures w14:val="none"/>
+        </w:rPr>
+        <w:t>Why it is needed:</w:t>
+      </w:r>
+      <w:r>
+        <w:rPr>
+          <w:rFonts w:ascii="Arial" w:eastAsia="Times New Roman" w:hAnsi="Arial" w:cs="Arial"/>
+          <w:color w:val="0F1115"/>
+          <w:kern w:val="0"/>
+          <w:sz w:val="24"/>
+          <w:szCs w:val="24"/>
+          <w:lang w:val="en-US" w:eastAsia="en-GB"/>
+          <w14:ligatures w14:val="none"/>
+        </w:rPr>
+        <w:t> This is the core “intelligence” of the project. It replaces template ideas such as energy-based command matching and pre-recorded “light on” clips in flash. The system understands open descriptions (“heavy bleeding,” “choking”) instead of only three fixed commands.</w:t>
       </w:r>
     </w:p>
     <w:p>
@@ -14764,70 +14720,6 @@
           <w14:ligatures w14:val="none"/>
         </w:rPr>
       </w:pPr>
-      <w:r>
-        <w:rPr>
-          <w:rFonts w:ascii="Arial" w:eastAsia="Times New Roman" w:hAnsi="Arial" w:cs="Arial"/>
-          <w:color w:val="0F1115"/>
-          <w:kern w:val="0"/>
-          <w:sz w:val="24"/>
-          <w:szCs w:val="24"/>
-          <w:lang w:val="en-US" w:eastAsia="en-GB"/>
-          <w14:ligatures w14:val="none"/>
-        </w:rPr>
-        <w:t>We do </w:t>
-      </w:r>
-      <w:r>
-        <w:rPr>
-          <w:rFonts w:ascii="Arial" w:eastAsia="Times New Roman" w:hAnsi="Arial" w:cs="Arial"/>
-          <w:b/>
-          <w:bCs/>
-          <w:color w:val="0F1115"/>
-          <w:kern w:val="0"/>
-          <w:sz w:val="24"/>
-          <w:szCs w:val="24"/>
-          <w:lang w:val="en-US" w:eastAsia="en-GB"/>
-          <w14:ligatures w14:val="none"/>
-        </w:rPr>
-        <w:t>not</w:t>
-      </w:r>
-      <w:r>
-        <w:rPr>
-          <w:rFonts w:ascii="Arial" w:eastAsia="Times New Roman" w:hAnsi="Arial" w:cs="Arial"/>
-          <w:color w:val="0F1115"/>
-          <w:kern w:val="0"/>
-          <w:sz w:val="24"/>
-          <w:szCs w:val="24"/>
-          <w:lang w:val="en-US" w:eastAsia="en-GB"/>
-          <w14:ligatures w14:val="none"/>
-        </w:rPr>
-        <w:t xml:space="preserve"> load a </w:t>
-      </w:r>
-      <w:proofErr w:type="spellStart"/>
-      <w:r>
-        <w:rPr>
-          <w:rFonts w:ascii="Arial" w:eastAsia="Times New Roman" w:hAnsi="Arial" w:cs="Arial"/>
-          <w:color w:val="0F1115"/>
-          <w:kern w:val="0"/>
-          <w:sz w:val="24"/>
-          <w:szCs w:val="24"/>
-          <w:lang w:val="en-US" w:eastAsia="en-GB"/>
-          <w14:ligatures w14:val="none"/>
-        </w:rPr>
-        <w:t>TFLite</w:t>
-      </w:r>
-      <w:proofErr w:type="spellEnd"/>
-      <w:r>
-        <w:rPr>
-          <w:rFonts w:ascii="Arial" w:eastAsia="Times New Roman" w:hAnsi="Arial" w:cs="Arial"/>
-          <w:color w:val="0F1115"/>
-          <w:kern w:val="0"/>
-          <w:sz w:val="24"/>
-          <w:szCs w:val="24"/>
-          <w:lang w:val="en-US" w:eastAsia="en-GB"/>
-          <w14:ligatures w14:val="none"/>
-        </w:rPr>
-        <w:t xml:space="preserve"> wake-word model, record a fixed two seconds after “Hey Assistant,” or play canned responses from PROGMEM. That design would fit a simple light switch; our goal is an offline first-aid voice assistant with an LLM on the PC. Wake-word on the ESP32 remains possible future work (Edge Impulse) but is not in the submitted firmware.</w:t>
-      </w:r>
     </w:p>
     <w:p>
       <w:pPr>
@@ -14874,6 +14766,165 @@
           <w:lang w:val="en-US" w:eastAsia="en-GB"/>
           <w14:ligatures w14:val="none"/>
         </w:rPr>
+        <w:t>What we do not implement (template vs our project)</w:t>
+      </w:r>
+    </w:p>
+    <w:p>
+      <w:pPr>
+        <w:tabs>
+          <w:tab w:val="left" w:pos="916"/>
+          <w:tab w:val="left" w:pos="1832"/>
+          <w:tab w:val="left" w:pos="2748"/>
+          <w:tab w:val="left" w:pos="3664"/>
+          <w:tab w:val="left" w:pos="4580"/>
+          <w:tab w:val="left" w:pos="5496"/>
+          <w:tab w:val="left" w:pos="6412"/>
+          <w:tab w:val="left" w:pos="7328"/>
+          <w:tab w:val="left" w:pos="8244"/>
+          <w:tab w:val="left" w:pos="9160"/>
+          <w:tab w:val="left" w:pos="10076"/>
+          <w:tab w:val="left" w:pos="10992"/>
+          <w:tab w:val="left" w:pos="11908"/>
+          <w:tab w:val="left" w:pos="12824"/>
+          <w:tab w:val="left" w:pos="13740"/>
+          <w:tab w:val="left" w:pos="14656"/>
+        </w:tabs>
+        <w:wordWrap w:val="0"/>
+        <w:spacing w:after="0" w:line="330" w:lineRule="atLeast"/>
+        <w:jc w:val="both"/>
+        <w:rPr>
+          <w:rFonts w:ascii="Arial" w:eastAsia="Times New Roman" w:hAnsi="Arial" w:cs="Arial"/>
+          <w:color w:val="0F1115"/>
+          <w:kern w:val="0"/>
+          <w:sz w:val="24"/>
+          <w:szCs w:val="24"/>
+          <w:lang w:val="en-US" w:eastAsia="en-GB"/>
+          <w14:ligatures w14:val="none"/>
+        </w:rPr>
+      </w:pPr>
+      <w:r>
+        <w:rPr>
+          <w:rFonts w:ascii="Arial" w:eastAsia="Times New Roman" w:hAnsi="Arial" w:cs="Arial"/>
+          <w:color w:val="0F1115"/>
+          <w:kern w:val="0"/>
+          <w:sz w:val="24"/>
+          <w:szCs w:val="24"/>
+          <w:lang w:val="en-US" w:eastAsia="en-GB"/>
+          <w14:ligatures w14:val="none"/>
+        </w:rPr>
+        <w:t>We do </w:t>
+      </w:r>
+      <w:r>
+        <w:rPr>
+          <w:rFonts w:ascii="Arial" w:eastAsia="Times New Roman" w:hAnsi="Arial" w:cs="Arial"/>
+          <w:b/>
+          <w:bCs/>
+          <w:color w:val="0F1115"/>
+          <w:kern w:val="0"/>
+          <w:sz w:val="24"/>
+          <w:szCs w:val="24"/>
+          <w:lang w:val="en-US" w:eastAsia="en-GB"/>
+          <w14:ligatures w14:val="none"/>
+        </w:rPr>
+        <w:t>not</w:t>
+      </w:r>
+      <w:r>
+        <w:rPr>
+          <w:rFonts w:ascii="Arial" w:eastAsia="Times New Roman" w:hAnsi="Arial" w:cs="Arial"/>
+          <w:color w:val="0F1115"/>
+          <w:kern w:val="0"/>
+          <w:sz w:val="24"/>
+          <w:szCs w:val="24"/>
+          <w:lang w:val="en-US" w:eastAsia="en-GB"/>
+          <w14:ligatures w14:val="none"/>
+        </w:rPr>
+        <w:t xml:space="preserve"> load a </w:t>
+      </w:r>
+      <w:proofErr w:type="spellStart"/>
+      <w:r>
+        <w:rPr>
+          <w:rFonts w:ascii="Arial" w:eastAsia="Times New Roman" w:hAnsi="Arial" w:cs="Arial"/>
+          <w:color w:val="0F1115"/>
+          <w:kern w:val="0"/>
+          <w:sz w:val="24"/>
+          <w:szCs w:val="24"/>
+          <w:lang w:val="en-US" w:eastAsia="en-GB"/>
+          <w14:ligatures w14:val="none"/>
+        </w:rPr>
+        <w:t>TFLite</w:t>
+      </w:r>
+      <w:proofErr w:type="spellEnd"/>
+      <w:r>
+        <w:rPr>
+          <w:rFonts w:ascii="Arial" w:eastAsia="Times New Roman" w:hAnsi="Arial" w:cs="Arial"/>
+          <w:color w:val="0F1115"/>
+          <w:kern w:val="0"/>
+          <w:sz w:val="24"/>
+          <w:szCs w:val="24"/>
+          <w:lang w:val="en-US" w:eastAsia="en-GB"/>
+          <w14:ligatures w14:val="none"/>
+        </w:rPr>
+        <w:t xml:space="preserve"> wake-word model, record a fixed two seconds after “Hey Assistant,” or play canned responses from PROGMEM. That design would fit a simple li</w:t>
+      </w:r>
+      <w:r>
+        <w:rPr>
+          <w:rFonts w:ascii="Arial" w:eastAsia="Times New Roman" w:hAnsi="Arial" w:cs="Arial"/>
+          <w:color w:val="0F1115"/>
+          <w:kern w:val="0"/>
+          <w:sz w:val="24"/>
+          <w:szCs w:val="24"/>
+          <w:lang w:val="en-US" w:eastAsia="en-GB"/>
+          <w14:ligatures w14:val="none"/>
+        </w:rPr>
+        <w:lastRenderedPageBreak/>
+        <w:t>ght switch; our goal is an offline first-aid voice assistant with an LLM on the PC. Wake-word on the ESP32 remains possible future work (Edge Impulse) but is not in the submitted firmware.</w:t>
+      </w:r>
+    </w:p>
+    <w:p>
+      <w:pPr>
+        <w:tabs>
+          <w:tab w:val="left" w:pos="916"/>
+          <w:tab w:val="left" w:pos="1832"/>
+          <w:tab w:val="left" w:pos="2748"/>
+          <w:tab w:val="left" w:pos="3664"/>
+          <w:tab w:val="left" w:pos="4580"/>
+          <w:tab w:val="left" w:pos="5496"/>
+          <w:tab w:val="left" w:pos="6412"/>
+          <w:tab w:val="left" w:pos="7328"/>
+          <w:tab w:val="left" w:pos="8244"/>
+          <w:tab w:val="left" w:pos="9160"/>
+          <w:tab w:val="left" w:pos="10076"/>
+          <w:tab w:val="left" w:pos="10992"/>
+          <w:tab w:val="left" w:pos="11908"/>
+          <w:tab w:val="left" w:pos="12824"/>
+          <w:tab w:val="left" w:pos="13740"/>
+          <w:tab w:val="left" w:pos="14656"/>
+        </w:tabs>
+        <w:wordWrap w:val="0"/>
+        <w:spacing w:after="0" w:line="330" w:lineRule="atLeast"/>
+        <w:jc w:val="both"/>
+        <w:rPr>
+          <w:rFonts w:ascii="Arial" w:eastAsia="Times New Roman" w:hAnsi="Arial" w:cs="Arial"/>
+          <w:color w:val="0F1115"/>
+          <w:kern w:val="0"/>
+          <w:sz w:val="24"/>
+          <w:szCs w:val="24"/>
+          <w:lang w:val="en-US" w:eastAsia="en-GB"/>
+          <w14:ligatures w14:val="none"/>
+        </w:rPr>
+      </w:pPr>
+      <w:r>
+        <w:rPr>
+          <w:rFonts w:ascii="Arial" w:eastAsia="Times New Roman" w:hAnsi="Arial" w:cs="Arial"/>
+          <w:b/>
+          <w:bCs/>
+          <w:color w:val="0F1115"/>
+          <w:kern w:val="0"/>
+          <w:sz w:val="24"/>
+          <w:szCs w:val="24"/>
+          <w:lang w:val="en-US" w:eastAsia="en-GB"/>
+          <w14:ligatures w14:val="none"/>
+        </w:rPr>
         <w:t xml:space="preserve">Submission </w:t>
       </w:r>
       <w:proofErr w:type="gramStart"/>
@@ -15224,7 +15275,6 @@
           <w:lang w:val="en-US" w:eastAsia="en-GB"/>
           <w14:ligatures w14:val="none"/>
         </w:rPr>
-        <w:lastRenderedPageBreak/>
         <w:t xml:space="preserve">The INMP441 gives clean 16 kHz mono I2S data once wiring and sample rate were correct. We initially tried a higher sample rate and the playback path sounded wrong until we fixed 16 kHz and the stereo 32-bit slot format on the MAX98357A output. Sensor data is more nuanced but is computed by a real PPG pipeline, not a placeholder. </w:t>
       </w:r>
       <w:r>
@@ -15570,7 +15620,20 @@
           <w:lang w:val="en-US" w:eastAsia="en-GB"/>
           <w14:ligatures w14:val="none"/>
         </w:rPr>
-        <w:t xml:space="preserve"> runs on localhost; Whisper and Piper use local model files. The practical "connection" problems were serial-port related: choosing the correct COM port (data UART vs USB-JTAG log port), occasional need to reconnect after </w:t>
+        <w:t xml:space="preserve"> runs on localhost; Whisper and Piper use local model files. The practical "connection" problems were serial-port related: choosing the correct </w:t>
+      </w:r>
+      <w:r>
+        <w:rPr>
+          <w:rFonts w:ascii="Arial" w:eastAsia="Times New Roman" w:hAnsi="Arial" w:cs="Arial"/>
+          <w:color w:val="0F1115"/>
+          <w:kern w:val="0"/>
+          <w:sz w:val="24"/>
+          <w:szCs w:val="24"/>
+          <w:lang w:val="en-US" w:eastAsia="en-GB"/>
+          <w14:ligatures w14:val="none"/>
+        </w:rPr>
+        <w:lastRenderedPageBreak/>
+        <w:t xml:space="preserve">COM port (data UART vs USB-JTAG log port), occasional need to reconnect after </w:t>
       </w:r>
       <w:proofErr w:type="spellStart"/>
       <w:r>
@@ -15778,20 +15841,7 @@
           <w:lang w:val="en-US" w:eastAsia="en-GB"/>
           <w14:ligatures w14:val="none"/>
         </w:rPr>
-        <w:t xml:space="preserve">We solved these issues in the firmware and PC code that we submitted, not with wake-word muting or flash-stored PCM phrases. Command understanding is not amplitude thresholding on the ESP32; it is open-vocabulary speech recognition and an LLM on the PC. Echo from the speaker into the microphone can still happen physically on the </w:t>
-      </w:r>
-      <w:r>
-        <w:rPr>
-          <w:rFonts w:ascii="Arial" w:eastAsia="Times New Roman" w:hAnsi="Arial" w:cs="Arial"/>
-          <w:color w:val="0F1115"/>
-          <w:kern w:val="0"/>
-          <w:sz w:val="24"/>
-          <w:szCs w:val="24"/>
-          <w:lang w:val="en-US" w:eastAsia="en-GB"/>
-          <w14:ligatures w14:val="none"/>
-        </w:rPr>
-        <w:lastRenderedPageBreak/>
-        <w:t xml:space="preserve">breadboard, but we do not record while the ESP32 is in the speaking state, which reduces the worst cases. For future work we could add on-device wake word (Edge Impulse / </w:t>
+        <w:t xml:space="preserve">We solved these issues in the firmware and PC code that we submitted, not with wake-word muting or flash-stored PCM phrases. Command understanding is not amplitude thresholding on the ESP32; it is open-vocabulary speech recognition and an LLM on the PC. Echo from the speaker into the microphone can still happen physically on the breadboard, but we do not record while the ESP32 is in the speaking state, which reduces the worst cases. For future work we could add on-device wake word (Edge Impulse / </w:t>
       </w:r>
       <w:proofErr w:type="spellStart"/>
       <w:r>
@@ -15997,7 +16047,20 @@
           <w:lang w:eastAsia="en-GB"/>
           <w14:ligatures w14:val="none"/>
         </w:rPr>
-        <w:t>We did not achieve wake-word detection on the microcontroller or recognition of three fixed commands like “turn on the light.” Those were in the original template but not in our submitted firmware. Splitting work between the board and the laptop because of missing PSRAM was a necessary design choice, not a failure. If we count success as a working end-to-end pipeline with real hardware and local AI, then yes, we achieved our objectives.</w:t>
+        <w:t xml:space="preserve">We did not achieve wake-word detection on the microcontroller or recognition of three fixed commands like “turn on the light.” Those were in the original template but not in </w:t>
+      </w:r>
+      <w:r>
+        <w:rPr>
+          <w:rFonts w:ascii="Arial" w:eastAsia="Times New Roman" w:hAnsi="Arial" w:cs="Arial"/>
+          <w:color w:val="0F1115"/>
+          <w:kern w:val="0"/>
+          <w:sz w:val="24"/>
+          <w:szCs w:val="24"/>
+          <w:lang w:eastAsia="en-GB"/>
+          <w14:ligatures w14:val="none"/>
+        </w:rPr>
+        <w:lastRenderedPageBreak/>
+        <w:t>our submitted firmware. Splitting work between the board and the laptop because of missing PSRAM was a necessary design choice, not a failure. If we count success as a working end-to-end pipeline with real hardware and local AI, then yes, we achieved our objectives.</w:t>
       </w:r>
     </w:p>
     <w:p>
@@ -16195,7 +16258,6 @@
           <w:lang w:eastAsia="en-GB"/>
           <w14:ligatures w14:val="none"/>
         </w:rPr>
-        <w:lastRenderedPageBreak/>
         <w:t>9. Appendices</w:t>
       </w:r>
     </w:p>
@@ -16693,6 +16755,7 @@
           <w:sz w:val="24"/>
           <w:szCs w:val="24"/>
         </w:rPr>
+        <w:lastRenderedPageBreak/>
         <w:t>Ollama</w:t>
       </w:r>
       <w:proofErr w:type="spellEnd"/>
@@ -16854,6 +16917,11 @@
 
 <file path=word/numbering.xml><?xml version="1.0" encoding="utf-8"?>
 <w:numbering xmlns:wpc="http://schemas.microsoft.com/office/word/2010/wordprocessingCanvas" xmlns:cx="http://schemas.microsoft.com/office/drawing/2014/chartex" xmlns:cx1="http://schemas.microsoft.com/office/drawing/2015/9/8/chartex" xmlns:cx2="http://schemas.microsoft.com/office/drawing/2015/10/21/chartex" xmlns:cx3="http://schemas.microsoft.com/office/drawing/2016/5/9/chartex" xmlns:cx4="http://schemas.microsoft.com/office/drawing/2016/5/10/chartex" xmlns:cx5="http://schemas.microsoft.com/office/drawing/2016/5/11/chartex" xmlns:cx6="http://schemas.microsoft.com/office/drawing/2016/5/12/chartex" xmlns:cx7="http://schemas.microsoft.com/office/drawing/2016/5/13/chartex" xmlns:cx8="http://schemas.microsoft.com/office/drawing/2016/5/14/chartex" xmlns:mc="http://schemas.openxmlformats.org/markup-compatibility/2006" xmlns:aink="http://schemas.microsoft.com/office/drawing/2016/ink" xmlns:am3d="http://schemas.microsoft.com/office/drawing/2017/model3d" xmlns:o="urn:schemas-microsoft-com:office:office" xmlns:oel="http://schemas.microsoft.com/office/2019/extlst" xmlns:r="http://schemas.openxmlformats.org/officeDocument/2006/relationships" xmlns:m="http://schemas.openxmlformats.org/officeDocument/2006/math" xmlns:v="urn:schemas-microsoft-com:vml" xmlns:wp14="http://schemas.microsoft.com/office/word/2010/wordprocessingDrawing" xmlns:wp="http://schemas.openxmlformats.org/drawingml/2006/wordprocessingDrawing" xmlns:w10="urn:schemas-microsoft-com:office:word" xmlns:w="http://schemas.openxmlformats.org/wordprocessingml/2006/main" xmlns:w14="http://schemas.microsoft.com/office/word/2010/wordml" xmlns:w15="http://schemas.microsoft.com/office/word/2012/wordml" xmlns:w16cex="http://schemas.microsoft.com/office/word/2018/wordml/cex" xmlns:w16cid="http://schemas.microsoft.com/office/word/2016/wordml/cid" xmlns:w16="http://schemas.microsoft.com/office/word/2018/wordml" xmlns:w16du="http://schemas.microsoft.com/office/word/2023/wordml/word16du" xmlns:w16sdtdh="http://schemas.microsoft.com/office/word/2020/wordml/sdtdatahash" xmlns:w16sdtfl="http://schemas.microsoft.com/office/word/2024/wordml/sdtformatlock" xmlns:w16se="http://schemas.microsoft.com/office/word/2015/wordml/symex" xmlns:wpg="http://schemas.microsoft.com/office/word/2010/wordprocessingGroup" xmlns:wpi="http://schemas.microsoft.com/office/word/2010/wordprocessingInk" xmlns:wne="http://schemas.microsoft.com/office/word/2006/wordml" xmlns:wps="http://schemas.microsoft.com/office/word/2010/wordprocessingShape" mc:Ignorable="w14 w15 w16se w16cid w16 w16cex w16sdtdh w16sdtfl w16du wp14">
+  <w:numPicBullet w:numPicBulletId="0">
+    <w:pict>
+      <v:rect id="_x0000_i1025" style="width:0;height:1.5pt" o:hralign="center" o:bullet="t" o:hrstd="t" o:hr="t" fillcolor="#a0a0a0" stroked="f"/>
+    </w:pict>
+  </w:numPicBullet>
   <w:abstractNum w:abstractNumId="0" w15:restartNumberingAfterBreak="0">
     <w:nsid w:val="04B371E8"/>
     <w:multiLevelType w:val="hybridMultilevel"/>
@@ -24349,6 +24417,7 @@
   <w:style w:type="character" w:default="1" w:styleId="VarsaylanParagrafYazTipi">
     <w:name w:val="Default Paragraph Font"/>
     <w:uiPriority w:val="1"/>
+    <w:semiHidden/>
     <w:unhideWhenUsed/>
   </w:style>
   <w:style w:type="table" w:default="1" w:styleId="NormalTablo">
@@ -25229,6 +25298,23 @@
 </file>
 
 <file path=customXml/item1.xml><?xml version="1.0" encoding="utf-8"?>
+<?mso-contentType ?>
+<FormTemplates xmlns="http://schemas.microsoft.com/sharepoint/v3/contenttype/forms">
+  <Display>DocumentLibraryForm</Display>
+  <Edit>DocumentLibraryForm</Edit>
+  <New>DocumentLibraryForm</New>
+</FormTemplates>
+</file>
+
+<file path=customXml/item2.xml><?xml version="1.0" encoding="utf-8"?>
+<p:properties xmlns:p="http://schemas.microsoft.com/office/2006/metadata/properties" xmlns:xsi="http://www.w3.org/2001/XMLSchema-instance" xmlns:pc="http://schemas.microsoft.com/office/infopath/2007/PartnerControls">
+  <documentManagement>
+    <ReferenceId xmlns="67e1fb92-a6a1-4347-8543-ab68436ca3a7" xsi:nil="true"/>
+  </documentManagement>
+</p:properties>
+</file>
+
+<file path=customXml/item3.xml><?xml version="1.0" encoding="utf-8"?>
 <ct:contentTypeSchema xmlns:ct="http://schemas.microsoft.com/office/2006/metadata/contentType" xmlns:ma="http://schemas.microsoft.com/office/2006/metadata/properties/metaAttributes" ct:_="" ma:_="" ma:contentTypeName="Document" ma:contentTypeID="0x010100DF31AF11E81EB3478836C7BC26A04CBE" ma:contentTypeVersion="4" ma:contentTypeDescription="Create a new document." ma:contentTypeScope="" ma:versionID="14b826744c7651c14c8eea89c7810238">
   <xsd:schema xmlns:xsd="http://www.w3.org/2001/XMLSchema" xmlns:xs="http://www.w3.org/2001/XMLSchema" xmlns:p="http://schemas.microsoft.com/office/2006/metadata/properties" xmlns:ns2="67e1fb92-a6a1-4347-8543-ab68436ca3a7" targetNamespace="http://schemas.microsoft.com/office/2006/metadata/properties" ma:root="true" ma:fieldsID="efcadd7639573a60719bc8df25c37cfb" ns2:_="">
     <xsd:import namespace="67e1fb92-a6a1-4347-8543-ab68436ca3a7"/>
@@ -25372,24 +25458,25 @@
 </ct:contentTypeSchema>
 </file>
 
-<file path=customXml/item2.xml><?xml version="1.0" encoding="utf-8"?>
-<p:properties xmlns:p="http://schemas.microsoft.com/office/2006/metadata/properties" xmlns:xsi="http://www.w3.org/2001/XMLSchema-instance" xmlns:pc="http://schemas.microsoft.com/office/infopath/2007/PartnerControls">
-  <documentManagement>
-    <ReferenceId xmlns="67e1fb92-a6a1-4347-8543-ab68436ca3a7" xsi:nil="true"/>
-  </documentManagement>
-</p:properties>
+<file path=customXml/itemProps1.xml><?xml version="1.0" encoding="utf-8"?>
+<ds:datastoreItem xmlns:ds="http://schemas.openxmlformats.org/officeDocument/2006/customXml" ds:itemID="{1107230A-E2A4-415C-A814-BF20F27C7F59}">
+  <ds:schemaRefs>
+    <ds:schemaRef ds:uri="http://schemas.microsoft.com/sharepoint/v3/contenttype/forms"/>
+  </ds:schemaRefs>
+</ds:datastoreItem>
 </file>
 
-<file path=customXml/item3.xml><?xml version="1.0" encoding="utf-8"?>
-<?mso-contentType ?>
-<FormTemplates xmlns="http://schemas.microsoft.com/sharepoint/v3/contenttype/forms">
-  <Display>DocumentLibraryForm</Display>
-  <Edit>DocumentLibraryForm</Edit>
-  <New>DocumentLibraryForm</New>
-</FormTemplates>
+<file path=customXml/itemProps2.xml><?xml version="1.0" encoding="utf-8"?>
+<ds:datastoreItem xmlns:ds="http://schemas.openxmlformats.org/officeDocument/2006/customXml" ds:itemID="{9037C80D-D4A4-416D-A94A-59DDEAE799E1}">
+  <ds:schemaRefs>
+    <ds:schemaRef ds:uri="http://schemas.microsoft.com/office/2006/metadata/properties"/>
+    <ds:schemaRef ds:uri="http://schemas.microsoft.com/office/infopath/2007/PartnerControls"/>
+    <ds:schemaRef ds:uri="67e1fb92-a6a1-4347-8543-ab68436ca3a7"/>
+  </ds:schemaRefs>
+</ds:datastoreItem>
 </file>
 
-<file path=customXml/itemProps1.xml><?xml version="1.0" encoding="utf-8"?>
+<file path=customXml/itemProps3.xml><?xml version="1.0" encoding="utf-8"?>
 <ds:datastoreItem xmlns:ds="http://schemas.openxmlformats.org/officeDocument/2006/customXml" ds:itemID="{04A70D76-9A0D-494C-8F82-A5D6740DAAB8}">
   <ds:schemaRefs>
     <ds:schemaRef ds:uri="http://schemas.microsoft.com/office/2006/metadata/contentType"/>
@@ -25405,22 +25492,4 @@
     <ds:schemaRef ds:uri="http://schemas.microsoft.com/internal/obd"/>
   </ds:schemaRefs>
 </ds:datastoreItem>
-</file>
-
-<file path=customXml/itemProps2.xml><?xml version="1.0" encoding="utf-8"?>
-<ds:datastoreItem xmlns:ds="http://schemas.openxmlformats.org/officeDocument/2006/customXml" ds:itemID="{9037C80D-D4A4-416D-A94A-59DDEAE799E1}">
-  <ds:schemaRefs>
-    <ds:schemaRef ds:uri="http://schemas.microsoft.com/office/2006/metadata/properties"/>
-    <ds:schemaRef ds:uri="http://schemas.microsoft.com/office/infopath/2007/PartnerControls"/>
-    <ds:schemaRef ds:uri="67e1fb92-a6a1-4347-8543-ab68436ca3a7"/>
-  </ds:schemaRefs>
-</ds:datastoreItem>
-</file>
-
-<file path=customXml/itemProps3.xml><?xml version="1.0" encoding="utf-8"?>
-<ds:datastoreItem xmlns:ds="http://schemas.openxmlformats.org/officeDocument/2006/customXml" ds:itemID="{1107230A-E2A4-415C-A814-BF20F27C7F59}">
-  <ds:schemaRefs>
-    <ds:schemaRef ds:uri="http://schemas.microsoft.com/sharepoint/v3/contenttype/forms"/>
-  </ds:schemaRefs>
-</ds:datastoreItem>
 </file>
</xml_diff>